<commit_message>
[T-18] el guion marca que se dice siempre y que solo se responde
Siete paginas parecen 2600 palabras que memorizar. Lo que se pronuncia sin que nadie
pregunte son 670: la apertura, la demostracion, las limitaciones y el cierre. El resto
son respuestas que solo salen si alguien las pide.

Cada PARTE lo dice ahora bajo su titulo, y la pagina 1 lo resume de un vistazo.

Co-Authored-By: Claude Opus 5 <noreply@anthropic.com>
</commit_message>
<xml_diff>
--- a/docs/Chuleta sustentacion - Mini-JARVIS.docx
+++ b/docs/Chuleta sustentacion - Mini-JARVIS.docx
@@ -504,6 +504,88 @@
           <w:color w:val="0B6B63"/>
           <w:sz w:val="26"/>
         </w:rPr>
+        <w:t>QUE DICES Y QUE SOLO RESPONDES</w:t>
+      </w:r>
+    </w:p>
+    <w:p>
+      <w:pPr>
+        <w:spacing w:after="80"/>
+        <w:ind w:left="198"/>
+      </w:pPr>
+      <w:r>
+        <w:rPr>
+          <w:i/>
+          <w:color w:val="4A4A52"/>
+        </w:rPr>
+        <w:t>De las 7 paginas, hablas 2. El resto son respuestas esperando.</w:t>
+      </w:r>
+    </w:p>
+    <w:p>
+      <w:pPr>
+        <w:spacing w:after="40"/>
+        <w:ind w:left="198"/>
+      </w:pPr>
+      <w:r>
+        <w:rPr>
+          <w:color w:val="141414"/>
+        </w:rPr>
+        <w:t>•  Partes 1 y 2: las dices siempre. Son 6 minutos.</w:t>
+      </w:r>
+    </w:p>
+    <w:p>
+      <w:pPr>
+        <w:spacing w:after="40"/>
+        <w:ind w:left="198"/>
+      </w:pPr>
+      <w:r>
+        <w:rPr>
+          <w:color w:val="141414"/>
+        </w:rPr>
+        <w:t>•  Parte 5: las limitaciones las sacas tu, medio minuto.</w:t>
+      </w:r>
+    </w:p>
+    <w:p>
+      <w:pPr>
+        <w:spacing w:after="40"/>
+        <w:ind w:left="198"/>
+      </w:pPr>
+      <w:r>
+        <w:rPr>
+          <w:color w:val="141414"/>
+        </w:rPr>
+        <w:t>•  Cierre: siempre.</w:t>
+      </w:r>
+    </w:p>
+    <w:p>
+      <w:pPr>
+        <w:spacing w:after="40"/>
+        <w:ind w:left="198"/>
+      </w:pPr>
+      <w:r>
+        <w:rPr>
+          <w:color w:val="141414"/>
+        </w:rPr>
+        <w:t>•  Partes 3, 4 y el resto</w:t>
+      </w:r>
+      <w:r>
+        <w:rPr>
+          <w:color w:val="141414"/>
+        </w:rPr>
+        <w:t>: SOLO si preguntan.</w:t>
+      </w:r>
+    </w:p>
+    <w:p>
+      <w:pPr>
+        <w:keepNext/>
+        <w:spacing w:before="280" w:after="100"/>
+      </w:pPr>
+      <w:r>
+        <w:rPr>
+          <w:b/>
+          <w:color w:val="0B6B63"/>
+          <w:sz w:val="26"/>
+        </w:rPr>
+        <w:lastRenderedPageBreak/>
         <w:t>LAS CIFRAS</w:t>
       </w:r>
     </w:p>
@@ -555,7 +637,6 @@
     <w:p>
       <w:pPr>
         <w:keepNext/>
-        <w:spacing w:after="180"/>
       </w:pPr>
       <w:r>
         <w:rPr>
@@ -568,6 +649,21 @@
     </w:p>
     <w:p>
       <w:pPr>
+        <w:keepNext/>
+        <w:spacing w:after="180"/>
+      </w:pPr>
+      <w:r>
+        <w:rPr>
+          <w:rFonts w:ascii="Consolas" w:hAnsi="Consolas"/>
+          <w:b/>
+          <w:color w:val="A8255C"/>
+          <w:sz w:val="20"/>
+        </w:rPr>
+        <w:t>ESTO SE DICE SIEMPRE  ·  un minuto</w:t>
+      </w:r>
+    </w:p>
+    <w:p>
+      <w:pPr>
         <w:spacing w:after="140"/>
       </w:pPr>
       <w:r>
@@ -575,7 +671,14 @@
           <w:i/>
           <w:color w:val="4A4A52"/>
         </w:rPr>
-        <w:t>Lo primero que dices, sin que te pregunten. Un minuto.</w:t>
+        <w:t>Lo primero</w:t>
+      </w:r>
+      <w:r>
+        <w:rPr>
+          <w:i/>
+          <w:color w:val="4A4A52"/>
+        </w:rPr>
+        <w:t xml:space="preserve"> que dices, sin que te pregunten. Un minuto.</w:t>
       </w:r>
     </w:p>
     <w:p>
@@ -591,16 +694,7 @@
           <w:color w:val="141414"/>
           <w:sz w:val="19"/>
         </w:rPr>
-        <w:t>DI</w:t>
-      </w:r>
-      <w:r>
-        <w:rPr>
-          <w:rFonts w:ascii="Consolas" w:hAnsi="Consolas"/>
-          <w:b/>
-          <w:color w:val="141414"/>
-          <w:sz w:val="19"/>
-        </w:rPr>
-        <w:t>CES:</w:t>
+        <w:t>DICES:</w:t>
       </w:r>
     </w:p>
     <w:p>
@@ -652,14 +746,14 @@
           <w:color w:val="141414"/>
           <w:sz w:val="22"/>
         </w:rPr>
-        <w:t>Piensa con un modelo de lenguaje grande, que lee ese texto y escribe la re</w:t>
+        <w:t xml:space="preserve">Piensa con un modelo de </w:t>
       </w:r>
       <w:r>
         <w:rPr>
           <w:color w:val="141414"/>
           <w:sz w:val="22"/>
         </w:rPr>
-        <w:t>spuesta.</w:t>
+        <w:t>lenguaje grande, que lee ese texto y escribe la respuesta.</w:t>
       </w:r>
     </w:p>
     <w:p>
@@ -711,14 +805,14 @@
           <w:color w:val="141414"/>
           <w:sz w:val="22"/>
         </w:rPr>
-        <w:t xml:space="preserve">No entrene ningun modelo. El enunciado dice que no </w:t>
+        <w:t>No ent</w:t>
       </w:r>
       <w:r>
         <w:rPr>
           <w:color w:val="141414"/>
           <w:sz w:val="22"/>
         </w:rPr>
-        <w:t>hace falta y no es viable en un curso.</w:t>
+        <w:t>rene ningun modelo. El enunciado dice que no hace falta y no es viable en un curso.</w:t>
       </w:r>
     </w:p>
     <w:p>
@@ -766,7 +860,6 @@
     <w:p>
       <w:pPr>
         <w:keepNext/>
-        <w:spacing w:after="180"/>
       </w:pPr>
       <w:r>
         <w:rPr>
@@ -779,6 +872,30 @@
     </w:p>
     <w:p>
       <w:pPr>
+        <w:keepNext/>
+        <w:spacing w:after="180"/>
+      </w:pPr>
+      <w:r>
+        <w:rPr>
+          <w:rFonts w:ascii="Consolas" w:hAnsi="Consolas"/>
+          <w:b/>
+          <w:color w:val="A8255C"/>
+          <w:sz w:val="20"/>
+        </w:rPr>
+        <w:t xml:space="preserve">ESTO SE </w:t>
+      </w:r>
+      <w:r>
+        <w:rPr>
+          <w:rFonts w:ascii="Consolas" w:hAnsi="Consolas"/>
+          <w:b/>
+          <w:color w:val="A8255C"/>
+          <w:sz w:val="20"/>
+        </w:rPr>
+        <w:t>DICE SIEMPRE  ·  unos cinco minutos</w:t>
+      </w:r>
+    </w:p>
+    <w:p>
+      <w:pPr>
         <w:spacing w:after="140"/>
       </w:pPr>
       <w:r>
@@ -786,14 +903,7 @@
           <w:i/>
           <w:color w:val="4A4A52"/>
         </w:rPr>
-        <w:t xml:space="preserve">Cinco pasos. Cada uno: primero haces, luego </w:t>
-      </w:r>
-      <w:r>
-        <w:rPr>
-          <w:i/>
-          <w:color w:val="4A4A52"/>
-        </w:rPr>
-        <w:t>hablas.</w:t>
+        <w:t>Cinco pasos. Cada uno: primero haces, luego hablas.</w:t>
       </w:r>
     </w:p>
     <w:p>
@@ -871,7 +981,14 @@
           <w:color w:val="141414"/>
           <w:sz w:val="22"/>
         </w:rPr>
-        <w:t>Antes de que el texto entre, un componente llamado tokenizador lo corta en pedazos</w:t>
+        <w:t>Antes de que el texto entre, un componen</w:t>
+      </w:r>
+      <w:r>
+        <w:rPr>
+          <w:color w:val="141414"/>
+          <w:sz w:val="22"/>
+        </w:rPr>
+        <w:t>te llamado tokenizador lo corta en pedazos</w:t>
       </w:r>
     </w:p>
     <w:p>
@@ -897,14 +1014,7 @@
           <w:color w:val="141414"/>
           <w:sz w:val="22"/>
         </w:rPr>
-        <w:t>E</w:t>
-      </w:r>
-      <w:r>
-        <w:rPr>
-          <w:color w:val="141414"/>
-          <w:sz w:val="22"/>
-        </w:rPr>
-        <w:t>l modelo por dentro solo ve esa lista de numeros.</w:t>
+        <w:t>El modelo por dentro solo ve esa lista de numeros.</w:t>
       </w:r>
     </w:p>
     <w:p>
@@ -930,7 +1040,14 @@
           <w:color w:val="141414"/>
           <w:sz w:val="22"/>
         </w:rPr>
-        <w:t>Miren Mini-JARVIS: se parte en cuatro pedazos, porque no existe en el vocabulario del modelo.</w:t>
+        <w:t xml:space="preserve">Miren Mini-JARVIS: se parte en cuatro pedazos, porque no </w:t>
+      </w:r>
+      <w:r>
+        <w:rPr>
+          <w:color w:val="141414"/>
+          <w:sz w:val="22"/>
+        </w:rPr>
+        <w:t>existe en el vocabulario del modelo.</w:t>
       </w:r>
     </w:p>
     <w:p>
@@ -943,14 +1060,7 @@
           <w:color w:val="141414"/>
           <w:sz w:val="22"/>
         </w:rPr>
-        <w:t>Y bateria y portatil se parten en tres cada una, porqu</w:t>
-      </w:r>
-      <w:r>
-        <w:rPr>
-          <w:color w:val="141414"/>
-          <w:sz w:val="22"/>
-        </w:rPr>
-        <w:t>e llevan tilde.</w:t>
+        <w:t>Y bateria y portatil se parten en tres cada una, porque llevan tilde.</w:t>
       </w:r>
     </w:p>
     <w:p>
@@ -978,7 +1088,15 @@
           <w:color w:val="141414"/>
           <w:sz w:val="23"/>
         </w:rPr>
-        <w:t>PASO 2  ·  El mapa de atencion</w:t>
+        <w:t>PASO 2</w:t>
+      </w:r>
+      <w:r>
+        <w:rPr>
+          <w:b/>
+          <w:color w:val="141414"/>
+          <w:sz w:val="23"/>
+        </w:rPr>
+        <w:t xml:space="preserve">  ·  El mapa de atencion</w:t>
       </w:r>
     </w:p>
     <w:p>
@@ -1029,14 +1147,7 @@
           <w:color w:val="141414"/>
           <w:sz w:val="22"/>
         </w:rPr>
-        <w:t xml:space="preserve">Esto es el </w:t>
-      </w:r>
-      <w:r>
-        <w:rPr>
-          <w:color w:val="141414"/>
-          <w:sz w:val="22"/>
-        </w:rPr>
-        <w:t>self-attention, que es el corazon del Transformer.</w:t>
+        <w:t>Esto es el self-attention, que es el corazon del Transformer.</w:t>
       </w:r>
     </w:p>
     <w:p>
@@ -1062,7 +1173,14 @@
           <w:color w:val="141414"/>
           <w:sz w:val="22"/>
         </w:rPr>
-        <w:t>Lo brillante es donde pone su atencion.</w:t>
+        <w:t>Lo brillante es donde pone su at</w:t>
+      </w:r>
+      <w:r>
+        <w:rPr>
+          <w:color w:val="141414"/>
+          <w:sz w:val="22"/>
+        </w:rPr>
+        <w:t>encion.</w:t>
       </w:r>
     </w:p>
     <w:p>
@@ -1075,14 +1193,7 @@
           <w:color w:val="141414"/>
           <w:sz w:val="22"/>
         </w:rPr>
-        <w:t xml:space="preserve">Fijense en que la franja brillante no esta en la diagonal: esta una casilla a la </w:t>
-      </w:r>
-      <w:r>
-        <w:rPr>
-          <w:color w:val="141414"/>
-          <w:sz w:val="22"/>
-        </w:rPr>
-        <w:t>izquierda.</w:t>
+        <w:t>Fijense en que la franja brillante no esta en la diagonal: esta una casilla a la izquierda.</w:t>
       </w:r>
     </w:p>
     <w:p>
@@ -1121,7 +1232,14 @@
           <w:color w:val="141414"/>
           <w:sz w:val="22"/>
         </w:rPr>
-        <w:t>Mi modelo tiene doce capas de doce cabezas: ciento cuarenta y cuatro mapas distintos</w:t>
+        <w:t>Mi modelo tiene doce</w:t>
+      </w:r>
+      <w:r>
+        <w:rPr>
+          <w:color w:val="141414"/>
+          <w:sz w:val="22"/>
+        </w:rPr>
+        <w:t xml:space="preserve"> capas de doce cabezas: ciento cuarenta y cuatro mapas distintos</w:t>
       </w:r>
     </w:p>
     <w:p>
@@ -1134,14 +1252,8 @@
           <w:color w:val="141414"/>
           <w:sz w:val="22"/>
         </w:rPr>
-        <w:t>para esta misma frase, y</w:t>
-      </w:r>
-      <w:r>
-        <w:rPr>
-          <w:color w:val="141414"/>
-          <w:sz w:val="22"/>
-        </w:rPr>
-        <w:t xml:space="preserve"> cada uno aprendio a fijarse en un tipo de relacion diferente.</w:t>
+        <w:lastRenderedPageBreak/>
+        <w:t>para esta misma frase, y cada uno aprendio a fijarse en un tipo de relacion diferente.</w:t>
       </w:r>
     </w:p>
     <w:p>
@@ -1167,8 +1279,14 @@
           <w:color w:val="141414"/>
           <w:sz w:val="22"/>
         </w:rPr>
-        <w:lastRenderedPageBreak/>
-        <w:t>Los tokens [CLS] y [SEP] los anade el modelo: marcan el principio y el final de la frase.</w:t>
+        <w:t>Los tokens [CLS] y [SEP] los anade el modelo: marcan el princip</w:t>
+      </w:r>
+      <w:r>
+        <w:rPr>
+          <w:color w:val="141414"/>
+          <w:sz w:val="22"/>
+        </w:rPr>
+        <w:t>io y el final de la frase.</w:t>
       </w:r>
     </w:p>
     <w:p>
@@ -1182,469 +1300,461 @@
           <w:color w:val="4A4A52"/>
           <w:sz w:val="19"/>
         </w:rPr>
-        <w:t xml:space="preserve">Por que importa: es lo que permite que una palabra signifique </w:t>
-      </w:r>
+        <w:t>Por que importa: es lo que permite que una palabra signifique cosas distintas segun el contexto. Banco de rio no es banco de calle, y lo decide a quien atiende.</w:t>
+      </w:r>
+    </w:p>
+    <w:p>
+      <w:pPr>
+        <w:keepNext/>
+        <w:spacing w:before="220" w:after="80"/>
+      </w:pPr>
+      <w:r>
+        <w:rPr>
+          <w:b/>
+          <w:color w:val="141414"/>
+          <w:sz w:val="23"/>
+        </w:rPr>
+        <w:t>PASO 3  ·  La memoria</w:t>
+      </w:r>
+    </w:p>
+    <w:p>
+      <w:pPr>
+        <w:keepNext/>
+        <w:spacing w:before="100"/>
+        <w:ind w:left="170"/>
+      </w:pPr>
+      <w:r>
+        <w:rPr>
+          <w:b/>
+          <w:color w:val="A8255C"/>
+          <w:sz w:val="20"/>
+        </w:rPr>
+        <w:t xml:space="preserve">HACER:  </w:t>
+      </w:r>
+      <w:r>
+        <w:rPr>
+          <w:color w:val="A8255C"/>
+          <w:sz w:val="20"/>
+        </w:rPr>
+        <w:t>Senala el contador, debajo de los desl</w:t>
+      </w:r>
+      <w:r>
+        <w:rPr>
+          <w:color w:val="A8255C"/>
+          <w:sz w:val="20"/>
+        </w:rPr>
+        <w:t>izadores: «Memoria: X de 10 turnos».</w:t>
+      </w:r>
+    </w:p>
+    <w:p>
+      <w:pPr>
+        <w:keepNext/>
+        <w:spacing w:before="80" w:after="40"/>
+        <w:ind w:left="170"/>
+      </w:pPr>
+      <w:r>
+        <w:rPr>
+          <w:rFonts w:ascii="Consolas" w:hAnsi="Consolas"/>
+          <w:b/>
+          <w:color w:val="141414"/>
+          <w:sz w:val="19"/>
+        </w:rPr>
+        <w:t>DICES:</w:t>
+      </w:r>
+    </w:p>
+    <w:p>
+      <w:pPr>
+        <w:spacing w:after="40"/>
+        <w:ind w:left="425"/>
+      </w:pPr>
+      <w:r>
+        <w:rPr>
+          <w:color w:val="141414"/>
+          <w:sz w:val="22"/>
+        </w:rPr>
+        <w:t>Un modelo no recuerda nada entre una llamada y la siguiente.</w:t>
+      </w:r>
+    </w:p>
+    <w:p>
+      <w:pPr>
+        <w:spacing w:after="40"/>
+        <w:ind w:left="425"/>
+      </w:pPr>
+      <w:r>
+        <w:rPr>
+          <w:color w:val="141414"/>
+          <w:sz w:val="22"/>
+        </w:rPr>
+        <w:t>La ilusion de que sigue el hilo se consigue reenviandole la conversacion entera cada vez.</w:t>
+      </w:r>
+    </w:p>
+    <w:p>
+      <w:pPr>
+        <w:spacing w:after="40"/>
+        <w:ind w:left="425"/>
+      </w:pPr>
+      <w:r>
+        <w:rPr>
+          <w:color w:val="141414"/>
+          <w:sz w:val="22"/>
+        </w:rPr>
+        <w:t>Pero eso no puede crecer para siempre: hay un limite de conte</w:t>
+      </w:r>
+      <w:r>
+        <w:rPr>
+          <w:color w:val="141414"/>
+          <w:sz w:val="22"/>
+        </w:rPr>
+        <w:t>xto y ademas se paga por token.</w:t>
+      </w:r>
+    </w:p>
+    <w:p>
+      <w:pPr>
+        <w:spacing w:after="40"/>
+        <w:ind w:left="425"/>
+      </w:pPr>
+      <w:r>
+        <w:rPr>
+          <w:color w:val="141414"/>
+          <w:sz w:val="22"/>
+        </w:rPr>
+        <w:t>Mi sistema guarda los ultimos diez turnos y descarta el mas antiguo, nunca el mas nuevo,</w:t>
+      </w:r>
+    </w:p>
+    <w:p>
+      <w:pPr>
+        <w:spacing w:after="40"/>
+        <w:ind w:left="425"/>
+      </w:pPr>
+      <w:r>
+        <w:rPr>
+          <w:color w:val="141414"/>
+          <w:sz w:val="22"/>
+        </w:rPr>
+        <w:t>porque lo que se acaba de decir es lo mas relevante.</w:t>
+      </w:r>
+    </w:p>
+    <w:p>
+      <w:pPr>
+        <w:spacing w:after="40"/>
+        <w:ind w:left="425"/>
+      </w:pPr>
+      <w:r>
+        <w:rPr>
+          <w:color w:val="141414"/>
+          <w:sz w:val="22"/>
+        </w:rPr>
+        <w:t>Aqui se ve el contador. Corte por turnos y no por tokens a proposito:</w:t>
+      </w:r>
+    </w:p>
+    <w:p>
+      <w:pPr>
+        <w:spacing w:after="40"/>
+        <w:ind w:left="425"/>
+      </w:pPr>
+      <w:r>
+        <w:rPr>
+          <w:color w:val="141414"/>
+          <w:sz w:val="22"/>
+        </w:rPr>
+        <w:t xml:space="preserve">por </w:t>
+      </w:r>
+      <w:r>
+        <w:rPr>
+          <w:color w:val="141414"/>
+          <w:sz w:val="22"/>
+        </w:rPr>
+        <w:t>turnos es predecible y se puede ensenar en pantalla.</w:t>
+      </w:r>
+    </w:p>
+    <w:p>
+      <w:pPr>
+        <w:keepNext/>
+        <w:spacing w:before="220" w:after="80"/>
+      </w:pPr>
+      <w:r>
+        <w:rPr>
+          <w:b/>
+          <w:color w:val="141414"/>
+          <w:sz w:val="23"/>
+        </w:rPr>
+        <w:t>PASO 4  ·  El system prompt</w:t>
+      </w:r>
+    </w:p>
+    <w:p>
+      <w:pPr>
+        <w:keepNext/>
+        <w:spacing w:before="100"/>
+        <w:ind w:left="170"/>
+      </w:pPr>
+      <w:r>
+        <w:rPr>
+          <w:b/>
+          <w:color w:val="A8255C"/>
+          <w:sz w:val="20"/>
+        </w:rPr>
+        <w:t xml:space="preserve">HACER:  </w:t>
+      </w:r>
+      <w:r>
+        <w:rPr>
+          <w:color w:val="A8255C"/>
+          <w:sz w:val="20"/>
+        </w:rPr>
+        <w:t>Boton «system prompt».</w:t>
+      </w:r>
+    </w:p>
+    <w:p>
+      <w:pPr>
+        <w:keepNext/>
+        <w:spacing w:before="80" w:after="40"/>
+        <w:ind w:left="170"/>
+      </w:pPr>
+      <w:r>
+        <w:rPr>
+          <w:rFonts w:ascii="Consolas" w:hAnsi="Consolas"/>
+          <w:b/>
+          <w:color w:val="141414"/>
+          <w:sz w:val="19"/>
+        </w:rPr>
+        <w:t>DICES:</w:t>
+      </w:r>
+    </w:p>
+    <w:p>
+      <w:pPr>
+        <w:spacing w:after="40"/>
+        <w:ind w:left="425"/>
+      </w:pPr>
+      <w:r>
+        <w:rPr>
+          <w:color w:val="141414"/>
+          <w:sz w:val="22"/>
+        </w:rPr>
+        <w:t>Esto es lo que recibe el modelo antes de cada frase mia,</w:t>
+      </w:r>
+    </w:p>
+    <w:p>
+      <w:pPr>
+        <w:spacing w:after="40"/>
+        <w:ind w:left="425"/>
+      </w:pPr>
+      <w:r>
+        <w:rPr>
+          <w:color w:val="141414"/>
+          <w:sz w:val="22"/>
+        </w:rPr>
+        <w:t>y es lo unico que define quien es Elena.</w:t>
+      </w:r>
+    </w:p>
+    <w:p>
+      <w:pPr>
+        <w:spacing w:after="40"/>
+        <w:ind w:left="425"/>
+      </w:pPr>
+      <w:r>
+        <w:rPr>
+          <w:color w:val="141414"/>
+          <w:sz w:val="22"/>
+        </w:rPr>
+        <w:t xml:space="preserve">Le dice como se llama, que </w:t>
+      </w:r>
+      <w:r>
+        <w:rPr>
+          <w:color w:val="141414"/>
+          <w:sz w:val="22"/>
+        </w:rPr>
+        <w:t>responde a su nombre,</w:t>
+      </w:r>
+    </w:p>
+    <w:p>
+      <w:pPr>
+        <w:spacing w:after="40"/>
+        <w:ind w:left="425"/>
+      </w:pPr>
+      <w:r>
+        <w:rPr>
+          <w:color w:val="141414"/>
+          <w:sz w:val="22"/>
+        </w:rPr>
+        <w:t>que es una inteligencia artificial y que puede equivocarse,</w:t>
+      </w:r>
+    </w:p>
+    <w:p>
+      <w:pPr>
+        <w:spacing w:after="40"/>
+        <w:ind w:left="425"/>
+      </w:pPr>
+      <w:r>
+        <w:rPr>
+          <w:color w:val="141414"/>
+          <w:sz w:val="22"/>
+        </w:rPr>
+        <w:t>y que escriba en frases cortas sin listas ni simbolos,</w:t>
+      </w:r>
+    </w:p>
+    <w:p>
+      <w:pPr>
+        <w:spacing w:after="40"/>
+        <w:ind w:left="425"/>
+      </w:pPr>
+      <w:r>
+        <w:rPr>
+          <w:color w:val="141414"/>
+          <w:sz w:val="22"/>
+        </w:rPr>
+        <w:t>porque sus respuestas se leen en voz alta y una vineta no se pronuncia.</w:t>
+      </w:r>
+    </w:p>
+    <w:p>
+      <w:pPr>
+        <w:keepNext/>
+        <w:spacing w:before="220" w:after="80"/>
+      </w:pPr>
+      <w:r>
+        <w:rPr>
+          <w:b/>
+          <w:color w:val="141414"/>
+          <w:sz w:val="23"/>
+        </w:rPr>
+        <w:t>PASO 5  ·  La temperatura</w:t>
+      </w:r>
+    </w:p>
+    <w:p>
+      <w:pPr>
+        <w:keepNext/>
+        <w:spacing w:before="100"/>
+        <w:ind w:left="170"/>
+      </w:pPr>
+      <w:r>
+        <w:rPr>
+          <w:b/>
+          <w:color w:val="A8255C"/>
+          <w:sz w:val="20"/>
+        </w:rPr>
+        <w:t xml:space="preserve">HACER:  </w:t>
+      </w:r>
+      <w:r>
+        <w:rPr>
+          <w:color w:val="A8255C"/>
+          <w:sz w:val="20"/>
+        </w:rPr>
+        <w:t>Baja la tempe</w:t>
+      </w:r>
+      <w:r>
+        <w:rPr>
+          <w:color w:val="A8255C"/>
+          <w:sz w:val="20"/>
+        </w:rPr>
+        <w:t>ratura casi a cero, pregunta algo. Subela al maximo, pregunta lo mismo.</w:t>
+      </w:r>
+    </w:p>
+    <w:p>
+      <w:pPr>
+        <w:keepNext/>
+        <w:spacing w:before="80" w:after="40"/>
+        <w:ind w:left="170"/>
+      </w:pPr>
+      <w:r>
+        <w:rPr>
+          <w:rFonts w:ascii="Consolas" w:hAnsi="Consolas"/>
+          <w:b/>
+          <w:color w:val="141414"/>
+          <w:sz w:val="19"/>
+        </w:rPr>
+        <w:t>DICES:</w:t>
+      </w:r>
+    </w:p>
+    <w:p>
+      <w:pPr>
+        <w:spacing w:after="40"/>
+        <w:ind w:left="425"/>
+      </w:pPr>
+      <w:r>
+        <w:rPr>
+          <w:color w:val="141414"/>
+          <w:sz w:val="22"/>
+        </w:rPr>
+        <w:t>La temperatura es cuanto riesgo corre el modelo al elegir cada palabra siguiente.</w:t>
+      </w:r>
+    </w:p>
+    <w:p>
+      <w:pPr>
+        <w:spacing w:after="40"/>
+        <w:ind w:left="425"/>
+      </w:pPr>
+      <w:r>
+        <w:rPr>
+          <w:color w:val="141414"/>
+          <w:sz w:val="22"/>
+        </w:rPr>
+        <w:t>Cerca de cero elige siempre la mas probable: suena predecible, casi de manual.</w:t>
+      </w:r>
+    </w:p>
+    <w:p>
+      <w:pPr>
+        <w:spacing w:after="40"/>
+        <w:ind w:left="425"/>
+      </w:pPr>
+      <w:r>
+        <w:rPr>
+          <w:color w:val="141414"/>
+          <w:sz w:val="22"/>
+        </w:rPr>
+        <w:t>Alta, se permite</w:t>
+      </w:r>
+      <w:r>
+        <w:rPr>
+          <w:color w:val="141414"/>
+          <w:sz w:val="22"/>
+        </w:rPr>
+        <w:t xml:space="preserve"> opciones raras: es mas creativo y tambien mas propenso a equivocarse.</w:t>
+      </w:r>
+    </w:p>
+    <w:p>
+      <w:pPr>
+        <w:spacing w:after="40"/>
+        <w:ind w:left="425"/>
+      </w:pPr>
+      <w:r>
+        <w:rPr>
+          <w:color w:val="141414"/>
+          <w:sz w:val="22"/>
+        </w:rPr>
+        <w:t>El top_p va por otro camino: en vez de cambiar el riesgo de todas las opciones,</w:t>
+      </w:r>
+    </w:p>
+    <w:p>
+      <w:pPr>
+        <w:spacing w:after="40"/>
+        <w:ind w:left="425"/>
+      </w:pPr>
+      <w:r>
+        <w:rPr>
+          <w:color w:val="141414"/>
+          <w:sz w:val="22"/>
+        </w:rPr>
+        <w:t>se queda solo con las mas probables hasta acumular ese porcentaje.</w:t>
+      </w:r>
+    </w:p>
+    <w:p>
+      <w:pPr>
+        <w:spacing w:before="60" w:after="100"/>
+        <w:ind w:left="425"/>
+      </w:pPr>
       <w:r>
         <w:rPr>
           <w:i/>
           <w:color w:val="4A4A52"/>
           <w:sz w:val="19"/>
         </w:rPr>
-        <w:t>cosas distintas segun el contexto. Banco de rio no es banco de calle, y lo decide a quien atiende.</w:t>
-      </w:r>
-    </w:p>
-    <w:p>
-      <w:pPr>
-        <w:keepNext/>
-        <w:spacing w:before="220" w:after="80"/>
-      </w:pPr>
-      <w:r>
-        <w:rPr>
-          <w:b/>
-          <w:color w:val="141414"/>
-          <w:sz w:val="23"/>
-        </w:rPr>
-        <w:t>PASO 3  ·  La memoria</w:t>
-      </w:r>
-    </w:p>
-    <w:p>
-      <w:pPr>
-        <w:keepNext/>
-        <w:spacing w:before="100"/>
-        <w:ind w:left="170"/>
-      </w:pPr>
-      <w:r>
-        <w:rPr>
-          <w:b/>
-          <w:color w:val="A8255C"/>
-          <w:sz w:val="20"/>
-        </w:rPr>
-        <w:t xml:space="preserve">HACER:  </w:t>
-      </w:r>
-      <w:r>
-        <w:rPr>
-          <w:color w:val="A8255C"/>
-          <w:sz w:val="20"/>
-        </w:rPr>
-        <w:t>Senala el contador, debajo de los deslizadores: «Memoria: X de 10 turnos».</w:t>
-      </w:r>
-    </w:p>
-    <w:p>
-      <w:pPr>
-        <w:keepNext/>
-        <w:spacing w:before="80" w:after="40"/>
-        <w:ind w:left="170"/>
-      </w:pPr>
-      <w:r>
-        <w:rPr>
-          <w:rFonts w:ascii="Consolas" w:hAnsi="Consolas"/>
-          <w:b/>
-          <w:color w:val="141414"/>
-          <w:sz w:val="19"/>
-        </w:rPr>
-        <w:t>DICES:</w:t>
-      </w:r>
-    </w:p>
-    <w:p>
-      <w:pPr>
-        <w:spacing w:after="40"/>
-        <w:ind w:left="425"/>
-      </w:pPr>
-      <w:r>
-        <w:rPr>
-          <w:color w:val="141414"/>
-          <w:sz w:val="22"/>
-        </w:rPr>
-        <w:t xml:space="preserve">Un modelo no recuerda nada entre una llamada </w:t>
-      </w:r>
-      <w:r>
-        <w:rPr>
-          <w:color w:val="141414"/>
-          <w:sz w:val="22"/>
-        </w:rPr>
-        <w:t>y la siguiente.</w:t>
-      </w:r>
-    </w:p>
-    <w:p>
-      <w:pPr>
-        <w:spacing w:after="40"/>
-        <w:ind w:left="425"/>
-      </w:pPr>
-      <w:r>
-        <w:rPr>
-          <w:color w:val="141414"/>
-          <w:sz w:val="22"/>
-        </w:rPr>
-        <w:t>La ilusion de que sigue el hilo se consigue reenviandole la conversacion entera cada vez.</w:t>
-      </w:r>
-    </w:p>
-    <w:p>
-      <w:pPr>
-        <w:spacing w:after="40"/>
-        <w:ind w:left="425"/>
-      </w:pPr>
-      <w:r>
-        <w:rPr>
-          <w:color w:val="141414"/>
-          <w:sz w:val="22"/>
-        </w:rPr>
-        <w:t>Pero eso no puede crecer para siempre: hay un limite de contexto y ademas se paga por token.</w:t>
-      </w:r>
-    </w:p>
-    <w:p>
-      <w:pPr>
-        <w:spacing w:after="40"/>
-        <w:ind w:left="425"/>
-      </w:pPr>
-      <w:r>
-        <w:rPr>
-          <w:color w:val="141414"/>
-          <w:sz w:val="22"/>
-        </w:rPr>
-        <w:t>Mi sistema guarda los ultimos diez turnos y descarta el m</w:t>
-      </w:r>
-      <w:r>
-        <w:rPr>
-          <w:color w:val="141414"/>
-          <w:sz w:val="22"/>
-        </w:rPr>
-        <w:t>as antiguo, nunca el mas nuevo,</w:t>
-      </w:r>
-    </w:p>
-    <w:p>
-      <w:pPr>
-        <w:spacing w:after="40"/>
-        <w:ind w:left="425"/>
-      </w:pPr>
-      <w:r>
-        <w:rPr>
-          <w:color w:val="141414"/>
-          <w:sz w:val="22"/>
-        </w:rPr>
-        <w:t>porque lo que se acaba de decir es lo mas relevante.</w:t>
-      </w:r>
-    </w:p>
-    <w:p>
-      <w:pPr>
-        <w:spacing w:after="40"/>
-        <w:ind w:left="425"/>
-      </w:pPr>
-      <w:r>
-        <w:rPr>
-          <w:color w:val="141414"/>
-          <w:sz w:val="22"/>
-        </w:rPr>
-        <w:t>Aqui se ve el contador. Corte por turnos y no por tokens a proposito:</w:t>
-      </w:r>
-    </w:p>
-    <w:p>
-      <w:pPr>
-        <w:spacing w:after="40"/>
-        <w:ind w:left="425"/>
-      </w:pPr>
-      <w:r>
-        <w:rPr>
-          <w:color w:val="141414"/>
-          <w:sz w:val="22"/>
-        </w:rPr>
-        <w:t>por turnos es predecible y se puede ensenar en pantalla.</w:t>
-      </w:r>
-    </w:p>
-    <w:p>
-      <w:pPr>
-        <w:keepNext/>
-        <w:spacing w:before="220" w:after="80"/>
-      </w:pPr>
-      <w:r>
-        <w:rPr>
-          <w:b/>
-          <w:color w:val="141414"/>
-          <w:sz w:val="23"/>
-        </w:rPr>
-        <w:t>PASO 4  ·  El system prompt</w:t>
-      </w:r>
-    </w:p>
-    <w:p>
-      <w:pPr>
-        <w:keepNext/>
-        <w:spacing w:before="100"/>
-        <w:ind w:left="170"/>
-      </w:pPr>
-      <w:r>
-        <w:rPr>
-          <w:b/>
-          <w:color w:val="A8255C"/>
-          <w:sz w:val="20"/>
-        </w:rPr>
-        <w:t xml:space="preserve">HACER:  </w:t>
-      </w:r>
-      <w:r>
-        <w:rPr>
-          <w:color w:val="A8255C"/>
-          <w:sz w:val="20"/>
-        </w:rPr>
-        <w:t>Boton «s</w:t>
-      </w:r>
-      <w:r>
-        <w:rPr>
-          <w:color w:val="A8255C"/>
-          <w:sz w:val="20"/>
-        </w:rPr>
-        <w:t>ystem prompt».</w:t>
-      </w:r>
-    </w:p>
-    <w:p>
-      <w:pPr>
-        <w:keepNext/>
-        <w:spacing w:before="80" w:after="40"/>
-        <w:ind w:left="170"/>
-      </w:pPr>
-      <w:r>
-        <w:rPr>
-          <w:rFonts w:ascii="Consolas" w:hAnsi="Consolas"/>
-          <w:b/>
-          <w:color w:val="141414"/>
-          <w:sz w:val="19"/>
-        </w:rPr>
-        <w:t>DICES:</w:t>
-      </w:r>
-    </w:p>
-    <w:p>
-      <w:pPr>
-        <w:spacing w:after="40"/>
-        <w:ind w:left="425"/>
-      </w:pPr>
-      <w:r>
-        <w:rPr>
-          <w:color w:val="141414"/>
-          <w:sz w:val="22"/>
-        </w:rPr>
-        <w:t>Esto es lo que recibe el modelo antes de cada frase mia,</w:t>
-      </w:r>
-    </w:p>
-    <w:p>
-      <w:pPr>
-        <w:spacing w:after="40"/>
-        <w:ind w:left="425"/>
-      </w:pPr>
-      <w:r>
-        <w:rPr>
-          <w:color w:val="141414"/>
-          <w:sz w:val="22"/>
-        </w:rPr>
-        <w:t>y es lo unico que define quien es Elena.</w:t>
-      </w:r>
-    </w:p>
-    <w:p>
-      <w:pPr>
-        <w:spacing w:after="40"/>
-        <w:ind w:left="425"/>
-      </w:pPr>
-      <w:r>
-        <w:rPr>
-          <w:color w:val="141414"/>
-          <w:sz w:val="22"/>
-        </w:rPr>
-        <w:t>Le dice como se llama, que responde a su nombre,</w:t>
-      </w:r>
-    </w:p>
-    <w:p>
-      <w:pPr>
-        <w:spacing w:after="40"/>
-        <w:ind w:left="425"/>
-      </w:pPr>
-      <w:r>
-        <w:rPr>
-          <w:color w:val="141414"/>
-          <w:sz w:val="22"/>
-        </w:rPr>
-        <w:t>que es una inteligencia artificial y que puede equivocarse,</w:t>
-      </w:r>
-    </w:p>
-    <w:p>
-      <w:pPr>
-        <w:spacing w:after="40"/>
-        <w:ind w:left="425"/>
-      </w:pPr>
-      <w:r>
-        <w:rPr>
-          <w:color w:val="141414"/>
-          <w:sz w:val="22"/>
-        </w:rPr>
-        <w:t xml:space="preserve">y que escriba en </w:t>
-      </w:r>
-      <w:r>
-        <w:rPr>
-          <w:color w:val="141414"/>
-          <w:sz w:val="22"/>
-        </w:rPr>
-        <w:t>frases cortas sin listas ni simbolos,</w:t>
-      </w:r>
-    </w:p>
-    <w:p>
-      <w:pPr>
-        <w:spacing w:after="40"/>
-        <w:ind w:left="425"/>
-      </w:pPr>
-      <w:r>
-        <w:rPr>
-          <w:color w:val="141414"/>
-          <w:sz w:val="22"/>
-        </w:rPr>
-        <w:t>porque sus respuestas se leen en voz alta y una vineta no se pronuncia.</w:t>
-      </w:r>
-    </w:p>
-    <w:p>
-      <w:pPr>
-        <w:keepNext/>
-        <w:spacing w:before="220" w:after="80"/>
-      </w:pPr>
-      <w:r>
-        <w:rPr>
-          <w:b/>
-          <w:color w:val="141414"/>
-          <w:sz w:val="23"/>
-        </w:rPr>
-        <w:t>PASO 5  ·  La temperatura</w:t>
-      </w:r>
-    </w:p>
-    <w:p>
-      <w:pPr>
-        <w:keepNext/>
-        <w:spacing w:before="100"/>
-        <w:ind w:left="170"/>
-      </w:pPr>
-      <w:r>
-        <w:rPr>
-          <w:b/>
-          <w:color w:val="A8255C"/>
-          <w:sz w:val="20"/>
-        </w:rPr>
-        <w:t xml:space="preserve">HACER:  </w:t>
-      </w:r>
-      <w:r>
-        <w:rPr>
-          <w:color w:val="A8255C"/>
-          <w:sz w:val="20"/>
-        </w:rPr>
-        <w:t>Baja la temperatura casi a cero, pregunta algo. Subela al maximo, pregunta lo mismo.</w:t>
-      </w:r>
-    </w:p>
-    <w:p>
-      <w:pPr>
-        <w:keepNext/>
-        <w:spacing w:before="80" w:after="40"/>
-        <w:ind w:left="170"/>
-      </w:pPr>
-      <w:r>
-        <w:rPr>
-          <w:rFonts w:ascii="Consolas" w:hAnsi="Consolas"/>
-          <w:b/>
-          <w:color w:val="141414"/>
-          <w:sz w:val="19"/>
-        </w:rPr>
-        <w:t>DICES:</w:t>
-      </w:r>
-    </w:p>
-    <w:p>
-      <w:pPr>
-        <w:spacing w:after="40"/>
-        <w:ind w:left="425"/>
-      </w:pPr>
-      <w:r>
-        <w:rPr>
-          <w:color w:val="141414"/>
-          <w:sz w:val="22"/>
-        </w:rPr>
-        <w:t>La temperatura es cu</w:t>
-      </w:r>
-      <w:r>
-        <w:rPr>
-          <w:color w:val="141414"/>
-          <w:sz w:val="22"/>
-        </w:rPr>
-        <w:t>anto riesgo corre el modelo al elegir cada palabra siguiente.</w:t>
-      </w:r>
-    </w:p>
-    <w:p>
-      <w:pPr>
-        <w:spacing w:after="40"/>
-        <w:ind w:left="425"/>
-      </w:pPr>
-      <w:r>
-        <w:rPr>
-          <w:color w:val="141414"/>
-          <w:sz w:val="22"/>
-        </w:rPr>
-        <w:t>Cerca de cero elige siempre la mas probable: suena predecible, casi de manual.</w:t>
-      </w:r>
-    </w:p>
-    <w:p>
-      <w:pPr>
-        <w:spacing w:after="40"/>
-        <w:ind w:left="425"/>
-      </w:pPr>
-      <w:r>
-        <w:rPr>
-          <w:color w:val="141414"/>
-          <w:sz w:val="22"/>
-        </w:rPr>
-        <w:t>Alta, se permite opciones raras: es mas creativo y tambien mas propenso a equivocarse.</w:t>
-      </w:r>
-    </w:p>
-    <w:p>
-      <w:pPr>
-        <w:spacing w:after="40"/>
-        <w:ind w:left="425"/>
-      </w:pPr>
-      <w:r>
-        <w:rPr>
-          <w:color w:val="141414"/>
-          <w:sz w:val="22"/>
-        </w:rPr>
-        <w:t xml:space="preserve">El top_p va por otro </w:t>
-      </w:r>
-      <w:r>
-        <w:rPr>
-          <w:color w:val="141414"/>
-          <w:sz w:val="22"/>
-        </w:rPr>
-        <w:t>camino: en vez de cambiar el riesgo de todas las opciones,</w:t>
-      </w:r>
-    </w:p>
-    <w:p>
-      <w:pPr>
-        <w:spacing w:after="40"/>
-        <w:ind w:left="425"/>
-      </w:pPr>
-      <w:r>
-        <w:rPr>
-          <w:color w:val="141414"/>
-          <w:sz w:val="22"/>
-        </w:rPr>
-        <w:t>se queda solo con las mas probables hasta acumular ese porcentaje.</w:t>
-      </w:r>
-    </w:p>
-    <w:p>
-      <w:pPr>
-        <w:spacing w:before="60" w:after="100"/>
-        <w:ind w:left="425"/>
-      </w:pPr>
+        <w:t>Si preguntan por que el deslizador lle</w:t>
+      </w:r>
       <w:r>
         <w:rPr>
           <w:i/>
           <w:color w:val="4A4A52"/>
           <w:sz w:val="19"/>
         </w:rPr>
-        <w:t>Si preguntan por que el deslizador llega a 1.4 y no a 2: lo medi contra la API. A partir de 1.5 el modelo se atascaba unos cien se</w:t>
-      </w:r>
-      <w:r>
-        <w:rPr>
-          <w:i/>
-          <w:color w:val="4A4A52"/>
-          <w:sz w:val="19"/>
-        </w:rPr>
-        <w:t>gundos en dos de cada tres intentos.</w:t>
+        <w:t>ga a 1.4 y no a 2: lo medi contra la API. A partir de 1.5 el modelo se atascaba unos cien segundos en dos de cada tres intentos.</w:t>
       </w:r>
     </w:p>
     <w:p>
@@ -1665,7 +1775,6 @@
     <w:p>
       <w:pPr>
         <w:keepNext/>
-        <w:spacing w:after="180"/>
       </w:pPr>
       <w:r>
         <w:rPr>
@@ -1678,14 +1787,36 @@
     </w:p>
     <w:p>
       <w:pPr>
-        <w:spacing w:after="140"/>
-      </w:pPr>
-      <w:r>
-        <w:rPr>
+        <w:keepNext/>
+        <w:spacing w:after="180"/>
+      </w:pPr>
+      <w:r>
+        <w:rPr>
+          <w:rFonts w:ascii="Consolas" w:hAnsi="Consolas"/>
           <w:i/>
           <w:color w:val="4A4A52"/>
-        </w:rPr>
-        <w:t>Cuatro ya las respondiste en la demostracion. Estas son las dos que faltan, mas el resumen de todas.</w:t>
+          <w:sz w:val="20"/>
+        </w:rPr>
+        <w:t>Solo si preguntan. No lo digas de corrido.</w:t>
+      </w:r>
+    </w:p>
+    <w:p>
+      <w:pPr>
+        <w:spacing w:after="140"/>
+      </w:pPr>
+      <w:r>
+        <w:rPr>
+          <w:i/>
+          <w:color w:val="4A4A52"/>
+        </w:rPr>
+        <w:t xml:space="preserve">Cuatro ya las respondiste en la </w:t>
+      </w:r>
+      <w:r>
+        <w:rPr>
+          <w:i/>
+          <w:color w:val="4A4A52"/>
+        </w:rPr>
+        <w:t>demostracion. Estas son las dos que faltan, mas el resumen de todas.</w:t>
       </w:r>
     </w:p>
     <w:p>
@@ -1699,6 +1830,7 @@
           <w:color w:val="141414"/>
           <w:sz w:val="23"/>
         </w:rPr>
+        <w:lastRenderedPageBreak/>
         <w:t>¿Que diferencia hay entre tu modelo y un modelo base sin fine-tuning?</w:t>
       </w:r>
     </w:p>
@@ -1741,7 +1873,14 @@
           <w:color w:val="141414"/>
           <w:sz w:val="22"/>
         </w:rPr>
-        <w:t>Si le escribes «hola, quien eres», te continua una conversacion inventada</w:t>
+        <w:t>Si le escribes «hola, quien eres», te continua una conversacion inve</w:t>
+      </w:r>
+      <w:r>
+        <w:rPr>
+          <w:color w:val="141414"/>
+          <w:sz w:val="22"/>
+        </w:rPr>
+        <w:t>ntada</w:t>
       </w:r>
     </w:p>
     <w:p>
@@ -1767,15 +1906,7 @@
           <w:color w:val="141414"/>
           <w:sz w:val="22"/>
         </w:rPr>
-        <w:lastRenderedPageBreak/>
-        <w:t>El mio paso ademas por instruction-tuning, que le ensena que una</w:t>
-      </w:r>
-      <w:r>
-        <w:rPr>
-          <w:color w:val="141414"/>
-          <w:sz w:val="22"/>
-        </w:rPr>
-        <w:t xml:space="preserve"> pregunta se responde.</w:t>
+        <w:t>El mio paso ademas por instruction-tuning, que le ensena que una pregunta se responde.</w:t>
       </w:r>
     </w:p>
     <w:p>
@@ -1801,7 +1932,14 @@
           <w:color w:val="141414"/>
           <w:sz w:val="22"/>
         </w:rPr>
-        <w:t>Sin esa etapa el system prompt no serviria de nada:</w:t>
+        <w:t xml:space="preserve">Sin esa etapa el system </w:t>
+      </w:r>
+      <w:r>
+        <w:rPr>
+          <w:color w:val="141414"/>
+          <w:sz w:val="22"/>
+        </w:rPr>
+        <w:t>prompt no serviria de nada:</w:t>
       </w:r>
     </w:p>
     <w:p>
@@ -1828,15 +1966,7 @@
           <w:color w:val="4A4A52"/>
           <w:sz w:val="19"/>
         </w:rPr>
-        <w:t xml:space="preserve">Las tres etapas en orden: preentrenamiento (aprende a continuar </w:t>
-      </w:r>
-      <w:r>
-        <w:rPr>
-          <w:i/>
-          <w:color w:val="4A4A52"/>
-          <w:sz w:val="19"/>
-        </w:rPr>
-        <w:t>texto), fine-tuning (se especializa en un dominio), instruction-tuning (aprende a obedecer).</w:t>
+        <w:t>Las tres etapas en orden: preentrenamiento (aprende a continuar texto), fine-tuning (se especializa en un dominio), instruction-tuning (aprende a obedecer).</w:t>
       </w:r>
     </w:p>
     <w:p>
@@ -1850,7 +1980,15 @@
           <w:color w:val="141414"/>
           <w:sz w:val="23"/>
         </w:rPr>
-        <w:t>¿Que pasa si la conversacion excede la ventana de contexto?</w:t>
+        <w:t xml:space="preserve">¿Que pasa si la </w:t>
+      </w:r>
+      <w:r>
+        <w:rPr>
+          <w:b/>
+          <w:color w:val="141414"/>
+          <w:sz w:val="23"/>
+        </w:rPr>
+        <w:t>conversacion excede la ventana de contexto?</w:t>
       </w:r>
     </w:p>
     <w:p>
@@ -1891,14 +2029,7 @@
           <w:color w:val="141414"/>
           <w:sz w:val="22"/>
         </w:rPr>
-        <w:t>Elena no se rompe: simplemente deja de acordars</w:t>
-      </w:r>
-      <w:r>
-        <w:rPr>
-          <w:color w:val="141414"/>
-          <w:sz w:val="22"/>
-        </w:rPr>
-        <w:t>e del principio de la conversacion.</w:t>
+        <w:t>Elena no se rompe: simplemente deja de acordarse del principio de la conversacion.</w:t>
       </w:r>
     </w:p>
     <w:p>
@@ -1937,7 +2068,13 @@
         <w:rPr>
           <w:color w:val="141414"/>
         </w:rPr>
-        <w:t>•  Token → el pedazo mas chico que el modelo entiende. Ve numeros, no letras.</w:t>
+        <w:t xml:space="preserve">• </w:t>
+      </w:r>
+      <w:r>
+        <w:rPr>
+          <w:color w:val="141414"/>
+        </w:rPr>
+        <w:t xml:space="preserve"> Token → el pedazo mas chico que el modelo entiende. Ve numeros, no letras.</w:t>
       </w:r>
     </w:p>
     <w:p>
@@ -1949,13 +2086,7 @@
         <w:rPr>
           <w:color w:val="141414"/>
         </w:rPr>
-        <w:t xml:space="preserve">•  Self-attention → cada palabra decide a quien mirar. Da el </w:t>
-      </w:r>
-      <w:r>
-        <w:rPr>
-          <w:color w:val="141414"/>
-        </w:rPr>
-        <w:t>significado en contexto.</w:t>
+        <w:t>•  Self-attention → cada palabra decide a quien mirar. Da el significado en contexto.</w:t>
       </w:r>
     </w:p>
     <w:p>
@@ -1979,7 +2110,13 @@
         <w:rPr>
           <w:color w:val="141414"/>
         </w:rPr>
-        <w:t>•  Personalidad → la define el system prompt, y nada mas.</w:t>
+        <w:t xml:space="preserve">•  Personalidad </w:t>
+      </w:r>
+      <w:r>
+        <w:rPr>
+          <w:color w:val="141414"/>
+        </w:rPr>
+        <w:t>→ la define el system prompt, y nada mas.</w:t>
       </w:r>
     </w:p>
     <w:p>
@@ -2003,13 +2140,7 @@
         <w:rPr>
           <w:color w:val="141414"/>
         </w:rPr>
-        <w:t>•  Temperatura → cuanto riesgo co</w:t>
-      </w:r>
-      <w:r>
-        <w:rPr>
-          <w:color w:val="141414"/>
-        </w:rPr>
-        <w:t>rre al elegir la palabra siguiente.</w:t>
+        <w:t>•  Temperatura → cuanto riesgo corre al elegir la palabra siguiente.</w:t>
       </w:r>
     </w:p>
     <w:p>
@@ -2030,7 +2161,6 @@
     <w:p>
       <w:pPr>
         <w:keepNext/>
-        <w:spacing w:after="180"/>
       </w:pPr>
       <w:r>
         <w:rPr>
@@ -2044,6 +2174,30 @@
     <w:p>
       <w:pPr>
         <w:keepNext/>
+        <w:spacing w:after="180"/>
+      </w:pPr>
+      <w:r>
+        <w:rPr>
+          <w:rFonts w:ascii="Consolas" w:hAnsi="Consolas"/>
+          <w:i/>
+          <w:color w:val="4A4A52"/>
+          <w:sz w:val="20"/>
+        </w:rPr>
+        <w:t xml:space="preserve">Solo si preguntan. Es tu red de </w:t>
+      </w:r>
+      <w:r>
+        <w:rPr>
+          <w:rFonts w:ascii="Consolas" w:hAnsi="Consolas"/>
+          <w:i/>
+          <w:color w:val="4A4A52"/>
+          <w:sz w:val="20"/>
+        </w:rPr>
+        <w:t>seguridad.</w:t>
+      </w:r>
+    </w:p>
+    <w:p>
+      <w:pPr>
+        <w:keepNext/>
         <w:spacing w:before="220" w:after="80"/>
       </w:pPr>
       <w:r>
@@ -2107,7 +2261,14 @@
           <w:color w:val="141414"/>
           <w:sz w:val="22"/>
         </w:rPr>
-        <w:t>Lo que si hago es comprobarlo. Cojo una fila real de la matriz de atencion,</w:t>
+        <w:t xml:space="preserve">Lo que si hago es comprobarlo. Cojo una fila real de la </w:t>
+      </w:r>
+      <w:r>
+        <w:rPr>
+          <w:color w:val="141414"/>
+          <w:sz w:val="22"/>
+        </w:rPr>
+        <w:t>matriz de atencion,</w:t>
       </w:r>
     </w:p>
     <w:p>
@@ -2146,14 +2307,14 @@
           <w:color w:val="141414"/>
           <w:sz w:val="22"/>
         </w:rPr>
-        <w:t xml:space="preserve">Y ademas </w:t>
+        <w:t>Y ademas anadi una demostracion: aplico un softmax sobre tres pun</w:t>
       </w:r>
       <w:r>
         <w:rPr>
           <w:color w:val="141414"/>
           <w:sz w:val="22"/>
         </w:rPr>
-        <w:t>anadi una demostracion: aplico un softmax sobre tres puntajes cualesquiera</w:t>
+        <w:t>tajes cualesquiera</w:t>
       </w:r>
     </w:p>
     <w:p>
@@ -2180,15 +2341,501 @@
           <w:color w:val="4A4A52"/>
           <w:sz w:val="19"/>
         </w:rPr>
-        <w:t>Linea 424. Ahi mismo esta la tabla que demuestra que la temperatura es ese mismo calculo di</w:t>
-      </w:r>
+        <w:t>Linea 424. Ahi mismo esta la tabla que demuestra que la temperatura es ese mismo calculo dividiendo los puntajes antes.</w:t>
+      </w:r>
+    </w:p>
+    <w:p>
+      <w:pPr>
+        <w:keepNext/>
+        <w:spacing w:before="220" w:after="80"/>
+      </w:pPr>
+      <w:r>
+        <w:rPr>
+          <w:b/>
+          <w:color w:val="141414"/>
+          <w:sz w:val="23"/>
+        </w:rPr>
+        <w:t>¿Que son [CLS] y [SEP]?</w:t>
+      </w:r>
+    </w:p>
+    <w:p>
+      <w:pPr>
+        <w:keepNext/>
+        <w:spacing w:before="80" w:after="40"/>
+        <w:ind w:left="170"/>
+      </w:pPr>
+      <w:r>
+        <w:rPr>
+          <w:rFonts w:ascii="Consolas" w:hAnsi="Consolas"/>
+          <w:b/>
+          <w:color w:val="141414"/>
+          <w:sz w:val="19"/>
+        </w:rPr>
+        <w:t>DIC</w:t>
+      </w:r>
+      <w:r>
+        <w:rPr>
+          <w:rFonts w:ascii="Consolas" w:hAnsi="Consolas"/>
+          <w:b/>
+          <w:color w:val="141414"/>
+          <w:sz w:val="19"/>
+        </w:rPr>
+        <w:t>ES:</w:t>
+      </w:r>
+    </w:p>
+    <w:p>
+      <w:pPr>
+        <w:spacing w:after="40"/>
+        <w:ind w:left="425"/>
+      </w:pPr>
+      <w:r>
+        <w:rPr>
+          <w:color w:val="141414"/>
+          <w:sz w:val="22"/>
+        </w:rPr>
+        <w:t>Los anade el tokenizador, no los escribo yo.</w:t>
+      </w:r>
+    </w:p>
+    <w:p>
+      <w:pPr>
+        <w:spacing w:after="40"/>
+        <w:ind w:left="425"/>
+      </w:pPr>
+      <w:r>
+        <w:rPr>
+          <w:color w:val="141414"/>
+          <w:sz w:val="22"/>
+        </w:rPr>
+        <w:t>El [CLS] va al principio y viene de classification: es una casilla que recoge</w:t>
+      </w:r>
+    </w:p>
+    <w:p>
+      <w:pPr>
+        <w:spacing w:after="40"/>
+        <w:ind w:left="425"/>
+      </w:pPr>
+      <w:r>
+        <w:rPr>
+          <w:color w:val="141414"/>
+          <w:sz w:val="22"/>
+        </w:rPr>
+        <w:t>un resumen de toda la frase, y se usa cuando la tarea es clasificar.</w:t>
+      </w:r>
+    </w:p>
+    <w:p>
+      <w:pPr>
+        <w:spacing w:after="40"/>
+        <w:ind w:left="425"/>
+      </w:pPr>
+      <w:r>
+        <w:rPr>
+          <w:color w:val="141414"/>
+          <w:sz w:val="22"/>
+        </w:rPr>
+        <w:lastRenderedPageBreak/>
+        <w:t>El [SEP] marca el final, y separa las frases cuando le das d</w:t>
+      </w:r>
+      <w:r>
+        <w:rPr>
+          <w:color w:val="141414"/>
+          <w:sz w:val="22"/>
+        </w:rPr>
+        <w:t>os a la vez.</w:t>
+      </w:r>
+    </w:p>
+    <w:p>
+      <w:pPr>
+        <w:spacing w:after="40"/>
+        <w:ind w:left="425"/>
+      </w:pPr>
+      <w:r>
+        <w:rPr>
+          <w:color w:val="141414"/>
+          <w:sz w:val="22"/>
+        </w:rPr>
+        <w:t>En mi laboratorio no los uso para nada, porque no estoy clasificando:</w:t>
+      </w:r>
+    </w:p>
+    <w:p>
+      <w:pPr>
+        <w:spacing w:after="40"/>
+        <w:ind w:left="425"/>
+      </w:pPr>
+      <w:r>
+        <w:rPr>
+          <w:color w:val="141414"/>
+          <w:sz w:val="22"/>
+        </w:rPr>
+        <w:t>solo quiero los embeddings y la atencion. Aparecen porque el modelo siempre los pone.</w:t>
+      </w:r>
+    </w:p>
+    <w:p>
+      <w:pPr>
+        <w:spacing w:after="40"/>
+        <w:ind w:left="425"/>
+      </w:pPr>
+      <w:r>
+        <w:rPr>
+          <w:color w:val="141414"/>
+          <w:sz w:val="22"/>
+        </w:rPr>
+        <w:t>Por eso mi frase de dieciocho pedazos da veinte tokens: los dos de mas son estos.</w:t>
+      </w:r>
+    </w:p>
+    <w:p>
+      <w:pPr>
+        <w:keepNext/>
+        <w:spacing w:before="220" w:after="80"/>
+      </w:pPr>
+      <w:r>
+        <w:rPr>
+          <w:b/>
+          <w:color w:val="141414"/>
+          <w:sz w:val="23"/>
+        </w:rPr>
+        <w:t xml:space="preserve">¿Y </w:t>
+      </w:r>
+      <w:r>
+        <w:rPr>
+          <w:b/>
+          <w:color w:val="141414"/>
+          <w:sz w:val="23"/>
+        </w:rPr>
+        <w:t>por que no usas el [CLS]?</w:t>
+      </w:r>
+    </w:p>
+    <w:p>
+      <w:pPr>
+        <w:keepNext/>
+        <w:spacing w:before="80" w:after="40"/>
+        <w:ind w:left="170"/>
+      </w:pPr>
+      <w:r>
+        <w:rPr>
+          <w:rFonts w:ascii="Consolas" w:hAnsi="Consolas"/>
+          <w:b/>
+          <w:color w:val="141414"/>
+          <w:sz w:val="19"/>
+        </w:rPr>
+        <w:t>DICES:</w:t>
+      </w:r>
+    </w:p>
+    <w:p>
+      <w:pPr>
+        <w:spacing w:after="40"/>
+        <w:ind w:left="425"/>
+      </w:pPr>
+      <w:r>
+        <w:rPr>
+          <w:color w:val="141414"/>
+          <w:sz w:val="22"/>
+        </w:rPr>
+        <w:t>Porque mi objetivo era ensenar el mecanismo, no clasificar.</w:t>
+      </w:r>
+    </w:p>
+    <w:p>
+      <w:pPr>
+        <w:spacing w:after="40"/>
+        <w:ind w:left="425"/>
+      </w:pPr>
+      <w:r>
+        <w:rPr>
+          <w:color w:val="141414"/>
+          <w:sz w:val="22"/>
+        </w:rPr>
+        <w:t>Para eso necesito un vector por token, y el [CLS] hace lo contrario:</w:t>
+      </w:r>
+    </w:p>
+    <w:p>
+      <w:pPr>
+        <w:spacing w:after="40"/>
+        <w:ind w:left="425"/>
+      </w:pPr>
+      <w:r>
+        <w:rPr>
+          <w:color w:val="141414"/>
+          <w:sz w:val="22"/>
+        </w:rPr>
+        <w:t>aplasta la frase entera en un solo vector.</w:t>
+      </w:r>
+    </w:p>
+    <w:p>
+      <w:pPr>
+        <w:spacing w:after="40"/>
+        <w:ind w:left="425"/>
+      </w:pPr>
+      <w:r>
+        <w:rPr>
+          <w:color w:val="141414"/>
+          <w:sz w:val="22"/>
+        </w:rPr>
+        <w:t xml:space="preserve">Ademas, un [CLS] sin fine-tuning es un mal resumen </w:t>
+      </w:r>
+      <w:r>
+        <w:rPr>
+          <w:color w:val="141414"/>
+          <w:sz w:val="22"/>
+        </w:rPr>
+        <w:t>de la frase, es un resultado conocido.</w:t>
+      </w:r>
+    </w:p>
+    <w:p>
+      <w:pPr>
+        <w:spacing w:after="40"/>
+        <w:ind w:left="425"/>
+      </w:pPr>
+      <w:r>
+        <w:rPr>
+          <w:color w:val="141414"/>
+          <w:sz w:val="22"/>
+        </w:rPr>
+        <w:t>Para que sirviera tendria que ajustar el modelo, y el enunciado dice que no se espera</w:t>
+      </w:r>
+    </w:p>
+    <w:p>
+      <w:pPr>
+        <w:spacing w:after="40"/>
+        <w:ind w:left="425"/>
+      </w:pPr>
+      <w:r>
+        <w:rPr>
+          <w:color w:val="141414"/>
+          <w:sz w:val="22"/>
+        </w:rPr>
+        <w:t>que entrenemos nada.</w:t>
+      </w:r>
+    </w:p>
+    <w:p>
+      <w:pPr>
+        <w:keepNext/>
+        <w:spacing w:before="220" w:after="80"/>
+      </w:pPr>
+      <w:r>
+        <w:rPr>
+          <w:b/>
+          <w:color w:val="141414"/>
+          <w:sz w:val="23"/>
+        </w:rPr>
+        <w:t>¿Para que sirve el mapa de atencion?</w:t>
+      </w:r>
+    </w:p>
+    <w:p>
+      <w:pPr>
+        <w:keepNext/>
+        <w:spacing w:before="80" w:after="40"/>
+        <w:ind w:left="170"/>
+      </w:pPr>
+      <w:r>
+        <w:rPr>
+          <w:rFonts w:ascii="Consolas" w:hAnsi="Consolas"/>
+          <w:b/>
+          <w:color w:val="141414"/>
+          <w:sz w:val="19"/>
+        </w:rPr>
+        <w:t>DICES:</w:t>
+      </w:r>
+    </w:p>
+    <w:p>
+      <w:pPr>
+        <w:spacing w:after="40"/>
+        <w:ind w:left="425"/>
+      </w:pPr>
+      <w:r>
+        <w:rPr>
+          <w:color w:val="141414"/>
+          <w:sz w:val="22"/>
+        </w:rPr>
+        <w:t xml:space="preserve">No es una ilustracion que hice aparte: son los numeros reales que </w:t>
+      </w:r>
+      <w:r>
+        <w:rPr>
+          <w:color w:val="141414"/>
+          <w:sz w:val="22"/>
+        </w:rPr>
+        <w:t>el modelo calcula.</w:t>
+      </w:r>
+    </w:p>
+    <w:p>
+      <w:pPr>
+        <w:spacing w:after="40"/>
+        <w:ind w:left="425"/>
+      </w:pPr>
+      <w:r>
+        <w:rPr>
+          <w:color w:val="141414"/>
+          <w:sz w:val="22"/>
+        </w:rPr>
+        <w:t>Cada fila dice en que proporcion se mezclan las demas palabras</w:t>
+      </w:r>
+    </w:p>
+    <w:p>
+      <w:pPr>
+        <w:spacing w:after="40"/>
+        <w:ind w:left="425"/>
+      </w:pPr>
+      <w:r>
+        <w:rPr>
+          <w:color w:val="141414"/>
+          <w:sz w:val="22"/>
+        </w:rPr>
+        <w:t>para construir el significado de esa.</w:t>
+      </w:r>
+    </w:p>
+    <w:p>
+      <w:pPr>
+        <w:spacing w:after="40"/>
+        <w:ind w:left="425"/>
+      </w:pPr>
+      <w:r>
+        <w:rPr>
+          <w:color w:val="141414"/>
+          <w:sz w:val="22"/>
+        </w:rPr>
+        <w:t>Si borrara el codigo que dibuja el mapa, el asistente funcionaria igual:</w:t>
+      </w:r>
+    </w:p>
+    <w:p>
+      <w:pPr>
+        <w:spacing w:after="40"/>
+        <w:ind w:left="425"/>
+      </w:pPr>
+      <w:r>
+        <w:rPr>
+          <w:color w:val="141414"/>
+          <w:sz w:val="22"/>
+        </w:rPr>
+        <w:t xml:space="preserve">esos numeros se seguirian calculando. Lo unico que perderia es </w:t>
+      </w:r>
+      <w:r>
+        <w:rPr>
+          <w:color w:val="141414"/>
+          <w:sz w:val="22"/>
+        </w:rPr>
+        <w:t>poder verlos.</w:t>
+      </w:r>
+    </w:p>
+    <w:p>
+      <w:pPr>
+        <w:keepNext/>
+        <w:spacing w:before="220" w:after="80"/>
+      </w:pPr>
+      <w:r>
+        <w:rPr>
+          <w:b/>
+          <w:color w:val="141414"/>
+          <w:sz w:val="23"/>
+        </w:rPr>
+        <w:t>¿Por que no puedes ver los pesos del modelo de la nube?</w:t>
+      </w:r>
+    </w:p>
+    <w:p>
+      <w:pPr>
+        <w:keepNext/>
+        <w:spacing w:before="80" w:after="40"/>
+        <w:ind w:left="170"/>
+      </w:pPr>
+      <w:r>
+        <w:rPr>
+          <w:rFonts w:ascii="Consolas" w:hAnsi="Consolas"/>
+          <w:b/>
+          <w:color w:val="141414"/>
+          <w:sz w:val="19"/>
+        </w:rPr>
+        <w:t>DICES:</w:t>
+      </w:r>
+    </w:p>
+    <w:p>
+      <w:pPr>
+        <w:spacing w:after="40"/>
+        <w:ind w:left="425"/>
+      </w:pPr>
+      <w:r>
+        <w:rPr>
+          <w:color w:val="141414"/>
+          <w:sz w:val="22"/>
+        </w:rPr>
+        <w:t>Porque ese modelo no corre en mi computadora: corre en los servidores del proveedor.</w:t>
+      </w:r>
+    </w:p>
+    <w:p>
+      <w:pPr>
+        <w:spacing w:after="40"/>
+        <w:ind w:left="425"/>
+      </w:pPr>
+      <w:r>
+        <w:rPr>
+          <w:color w:val="141414"/>
+          <w:sz w:val="22"/>
+        </w:rPr>
+        <w:t>Lo unico que hay entre mi programa y el es una direccion web que recibe texto</w:t>
+      </w:r>
+    </w:p>
+    <w:p>
+      <w:pPr>
+        <w:spacing w:after="40"/>
+        <w:ind w:left="425"/>
+      </w:pPr>
+      <w:r>
+        <w:rPr>
+          <w:color w:val="141414"/>
+          <w:sz w:val="22"/>
+        </w:rPr>
+        <w:t>y devuelve texto</w:t>
+      </w:r>
+      <w:r>
+        <w:rPr>
+          <w:color w:val="141414"/>
+          <w:sz w:val="22"/>
+        </w:rPr>
+        <w:t>. Los pesos de atencion existen dentro de su servidor</w:t>
+      </w:r>
+    </w:p>
+    <w:p>
+      <w:pPr>
+        <w:spacing w:after="40"/>
+        <w:ind w:left="425"/>
+      </w:pPr>
+      <w:r>
+        <w:rPr>
+          <w:color w:val="141414"/>
+          <w:sz w:val="22"/>
+        </w:rPr>
+        <w:t>mientras calcula, y ahi se quedan. No hay ningun parametro para pedirlos.</w:t>
+      </w:r>
+    </w:p>
+    <w:p>
+      <w:pPr>
+        <w:spacing w:after="40"/>
+        <w:ind w:left="425"/>
+      </w:pPr>
+      <w:r>
+        <w:rPr>
+          <w:color w:val="141414"/>
+          <w:sz w:val="22"/>
+        </w:rPr>
+        <w:t>Por eso el laboratorio usa BETO, que se descarga y corre dentro de mi programa.</w:t>
+      </w:r>
+    </w:p>
+    <w:p>
+      <w:pPr>
+        <w:spacing w:before="60" w:after="100"/>
+        <w:ind w:left="425"/>
+      </w:pPr>
       <w:r>
         <w:rPr>
           <w:i/>
           <w:color w:val="4A4A52"/>
           <w:sz w:val="19"/>
         </w:rPr>
-        <w:t>vidiendo los puntajes antes.</w:t>
+        <w:t xml:space="preserve">Matiz importante: NO es que ese modelo no </w:t>
+      </w:r>
+      <w:r>
+        <w:rPr>
+          <w:i/>
+          <w:color w:val="4A4A52"/>
+          <w:sz w:val="19"/>
+        </w:rPr>
+        <w:t>tenga atencion. Todos los Transformers la tienen. Es que no te deja verla.</w:t>
       </w:r>
     </w:p>
     <w:p>
@@ -2202,7 +2849,117 @@
           <w:color w:val="141414"/>
           <w:sz w:val="23"/>
         </w:rPr>
-        <w:t>¿Que son [CLS] y [SEP]?</w:t>
+        <w:t>¿Que modelo usa cada cosa, y por que ese?</w:t>
+      </w:r>
+    </w:p>
+    <w:p>
+      <w:pPr>
+        <w:ind w:left="198"/>
+      </w:pPr>
+      <w:r>
+        <w:rPr>
+          <w:b/>
+          <w:color w:val="141414"/>
+        </w:rPr>
+        <w:t>Whisper large-v3</w:t>
+      </w:r>
+      <w:r>
+        <w:rPr>
+          <w:color w:val="141414"/>
+        </w:rPr>
+        <w:t xml:space="preserve"> (OpenAI) oye. Entrenado en muchos idiomas: el espanol le sale bien.</w:t>
+      </w:r>
+    </w:p>
+    <w:p>
+      <w:pPr>
+        <w:ind w:left="198"/>
+      </w:pPr>
+      <w:r>
+        <w:rPr>
+          <w:b/>
+          <w:color w:val="141414"/>
+        </w:rPr>
+        <w:t>Qwen3.8</w:t>
+      </w:r>
+      <w:r>
+        <w:rPr>
+          <w:color w:val="141414"/>
+        </w:rPr>
+        <w:t xml:space="preserve"> (Alibaba) piensa. Es de razonamiento: trabaja el problema antes de contestar.</w:t>
+      </w:r>
+    </w:p>
+    <w:p>
+      <w:pPr>
+        <w:ind w:left="198"/>
+      </w:pPr>
+      <w:r>
+        <w:rPr>
+          <w:b/>
+          <w:color w:val="141414"/>
+        </w:rPr>
+        <w:t>Llama-3.3-70B</w:t>
+      </w:r>
+      <w:r>
+        <w:rPr>
+          <w:color w:val="141414"/>
+        </w:rPr>
+        <w:t xml:space="preserve"> (Meta) es el alterno. 70B son setenta mil millones de parametros.</w:t>
+      </w:r>
+    </w:p>
+    <w:p>
+      <w:pPr>
+        <w:ind w:left="198"/>
+      </w:pPr>
+      <w:r>
+        <w:rPr>
+          <w:b/>
+          <w:color w:val="141414"/>
+        </w:rPr>
+        <w:t>edge-tts</w:t>
+      </w:r>
+      <w:r>
+        <w:rPr>
+          <w:color w:val="141414"/>
+        </w:rPr>
+        <w:t xml:space="preserve"> habla. No es</w:t>
+      </w:r>
+      <w:r>
+        <w:rPr>
+          <w:color w:val="141414"/>
+        </w:rPr>
+        <w:t xml:space="preserve"> un modelo: es una libreria que usa el servicio de voz de Microsoft.</w:t>
+      </w:r>
+    </w:p>
+    <w:p>
+      <w:pPr>
+        <w:ind w:left="198"/>
+      </w:pPr>
+      <w:r>
+        <w:rPr>
+          <w:b/>
+          <w:color w:val="141414"/>
+        </w:rPr>
+        <w:t>BETO</w:t>
+      </w:r>
+      <w:r>
+        <w:rPr>
+          <w:color w:val="141414"/>
+        </w:rPr>
+        <w:t xml:space="preserve"> (Universidad de Chile) no conversa. 110 millones de parametros, solo espanol, y se deja abrir por dentro.</w:t>
+      </w:r>
+    </w:p>
+    <w:p>
+      <w:pPr>
+        <w:keepNext/>
+        <w:spacing w:before="220" w:after="80"/>
+      </w:pPr>
+      <w:r>
+        <w:rPr>
+          <w:b/>
+          <w:color w:val="141414"/>
+          <w:sz w:val="23"/>
+        </w:rPr>
+        <w:t>¿Por que dos modelos de lenguaje y no uno?</w:t>
       </w:r>
     </w:p>
     <w:p>
@@ -2231,7 +2988,14 @@
           <w:color w:val="141414"/>
           <w:sz w:val="22"/>
         </w:rPr>
-        <w:t>Los anade el tokenizador, no los escribo yo.</w:t>
+        <w:t>Por una incidencia real. A</w:t>
+      </w:r>
+      <w:r>
+        <w:rPr>
+          <w:color w:val="141414"/>
+          <w:sz w:val="22"/>
+        </w:rPr>
+        <w:t xml:space="preserve"> tres dias de la entrega el proveedor retiro el alternativo</w:t>
       </w:r>
     </w:p>
     <w:p>
@@ -2244,7 +3008,7 @@
           <w:color w:val="141414"/>
           <w:sz w:val="22"/>
         </w:rPr>
-        <w:t>El [CLS] va al principio y viene de classification: es una casilla que recoge</w:t>
+        <w:t>que tenia puesto. Probe los ciento sesenta y nueve modelos del catalogo</w:t>
       </w:r>
     </w:p>
     <w:p>
@@ -2257,7 +3021,7 @@
           <w:color w:val="141414"/>
           <w:sz w:val="22"/>
         </w:rPr>
-        <w:t>un resumen de toda la frase, y se usa cuando la tarea es clasificar.</w:t>
+        <w:t>y solo veinte respondian.</w:t>
       </w:r>
     </w:p>
     <w:p>
@@ -2270,14 +3034,7 @@
           <w:color w:val="141414"/>
           <w:sz w:val="22"/>
         </w:rPr>
-        <w:t>El [</w:t>
-      </w:r>
-      <w:r>
-        <w:rPr>
-          <w:color w:val="141414"/>
-          <w:sz w:val="22"/>
-        </w:rPr>
-        <w:t>SEP] marca el final, y separa las frases cuando le das dos a la vez.</w:t>
+        <w:t>Los elegi de familias distintas a proposito: si los dos vienen de la misma,</w:t>
       </w:r>
     </w:p>
     <w:p>
@@ -2290,40 +3047,14 @@
           <w:color w:val="141414"/>
           <w:sz w:val="22"/>
         </w:rPr>
-        <w:t>En mi laboratorio no los uso para nada, porque no estoy clasificando:</w:t>
-      </w:r>
-    </w:p>
-    <w:p>
-      <w:pPr>
-        <w:spacing w:after="40"/>
-        <w:ind w:left="425"/>
-      </w:pPr>
+        <w:t>un problema del provee</w:t>
+      </w:r>
       <w:r>
         <w:rPr>
           <w:color w:val="141414"/>
           <w:sz w:val="22"/>
         </w:rPr>
-        <w:t>solo quiero los embeddings y la atencion. Aparecen porque el modelo siempre los pone.</w:t>
-      </w:r>
-    </w:p>
-    <w:p>
-      <w:pPr>
-        <w:spacing w:after="40"/>
-        <w:ind w:left="425"/>
-      </w:pPr>
-      <w:r>
-        <w:rPr>
-          <w:color w:val="141414"/>
-          <w:sz w:val="22"/>
-        </w:rPr>
-        <w:t>Por eso mi frase de dieciocho p</w:t>
-      </w:r>
-      <w:r>
-        <w:rPr>
-          <w:color w:val="141414"/>
-          <w:sz w:val="22"/>
-        </w:rPr>
-        <w:t>edazos da veinte tokens: los dos de mas son estos.</w:t>
+        <w:t>dor se los lleva a la vez.</w:t>
       </w:r>
     </w:p>
     <w:p>
@@ -2338,7 +3069,7 @@
           <w:sz w:val="23"/>
         </w:rPr>
         <w:lastRenderedPageBreak/>
-        <w:t>¿Y por que no usas el [CLS]?</w:t>
+        <w:t>¿Como funciona sin internet?</w:t>
       </w:r>
     </w:p>
     <w:p>
@@ -2367,7 +3098,7 @@
           <w:color w:val="141414"/>
           <w:sz w:val="22"/>
         </w:rPr>
-        <w:t>Porque mi objetivo era ensenar el mecanismo, no clasificar.</w:t>
+        <w:t>Si se cae la red, las tres piezas cambian solas a equivalentes que corren en mi laptop.</w:t>
       </w:r>
     </w:p>
     <w:p>
@@ -2380,7 +3111,7 @@
           <w:color w:val="141414"/>
           <w:sz w:val="22"/>
         </w:rPr>
-        <w:t>Para eso necesito un vector por token, y el [CLS] hace lo contrario:</w:t>
+        <w:t>Responde bastante peor, y no tiene sentido disimularlo: el modelo local es unas mil veces</w:t>
       </w:r>
     </w:p>
     <w:p>
@@ -2393,14 +3124,14 @@
           <w:color w:val="141414"/>
           <w:sz w:val="22"/>
         </w:rPr>
-        <w:t xml:space="preserve">aplasta la frase entera en un solo </w:t>
+        <w:t xml:space="preserve">mas pequeno. A </w:t>
       </w:r>
       <w:r>
         <w:rPr>
           <w:color w:val="141414"/>
           <w:sz w:val="22"/>
         </w:rPr>
-        <w:t>vector.</w:t>
+        <w:t>cambio, responde. Sin eso, quedarse sin red dejaba la aplicacion muerta.</w:t>
       </w:r>
     </w:p>
     <w:p>
@@ -2413,7 +3144,7 @@
           <w:color w:val="141414"/>
           <w:sz w:val="22"/>
         </w:rPr>
-        <w:t>Ademas, un [CLS] sin fine-tuning es un mal resumen de la frase, es un resultado conocido.</w:t>
+        <w:t>Y el cambio no es ciego: distingue entre quedarse sin red y tener la clave mal escrita.</w:t>
       </w:r>
     </w:p>
     <w:p>
@@ -2426,20 +3157,29 @@
           <w:color w:val="141414"/>
           <w:sz w:val="22"/>
         </w:rPr>
-        <w:t>Para que sirviera tendria que ajustar el modelo, y el enunciado dice que no se espera</w:t>
-      </w:r>
-    </w:p>
-    <w:p>
-      <w:pPr>
-        <w:spacing w:after="40"/>
+        <w:t>Si es la clave, no cambia a local, porque eso taparia un error de configuracion.</w:t>
+      </w:r>
+    </w:p>
+    <w:p>
+      <w:pPr>
+        <w:spacing w:before="60" w:after="100"/>
         <w:ind w:left="425"/>
       </w:pPr>
       <w:r>
         <w:rPr>
-          <w:color w:val="141414"/>
-          <w:sz w:val="22"/>
-        </w:rPr>
-        <w:t>que entrenemos nada.</w:t>
+          <w:i/>
+          <w:color w:val="4A4A52"/>
+          <w:sz w:val="19"/>
+        </w:rPr>
+        <w:t>Como lo hice s</w:t>
+      </w:r>
+      <w:r>
+        <w:rPr>
+          <w:i/>
+          <w:color w:val="4A4A52"/>
+          <w:sz w:val="19"/>
+        </w:rPr>
+        <w:t>in duplicar codigo: envolvi las tres piezas de nube, cada una con su equivalente local. El orquestador ni se entera de que existen.</w:t>
       </w:r>
     </w:p>
     <w:p>
@@ -2453,7 +3193,7 @@
           <w:color w:val="141414"/>
           <w:sz w:val="23"/>
         </w:rPr>
-        <w:t>¿Para que sirve el mapa de atencion?</w:t>
+        <w:t>¿Que fue lo mas dificil?</w:t>
       </w:r>
     </w:p>
     <w:p>
@@ -2482,14 +3222,7 @@
           <w:color w:val="141414"/>
           <w:sz w:val="22"/>
         </w:rPr>
-        <w:t xml:space="preserve">No es </w:t>
-      </w:r>
-      <w:r>
-        <w:rPr>
-          <w:color w:val="141414"/>
-          <w:sz w:val="22"/>
-        </w:rPr>
-        <w:t>una ilustracion que hice aparte: son los numeros reales que el modelo calcula.</w:t>
+        <w:t>Un fallo silencioso en el laboratorio. Pedia los pesos de atencion</w:t>
       </w:r>
     </w:p>
     <w:p>
@@ -2502,7 +3235,14 @@
           <w:color w:val="141414"/>
           <w:sz w:val="22"/>
         </w:rPr>
-        <w:t>Cada fila dice en que proporcion se mezclan las demas palabras</w:t>
+        <w:t xml:space="preserve">y me llegaban </w:t>
+      </w:r>
+      <w:r>
+        <w:rPr>
+          <w:color w:val="141414"/>
+          <w:sz w:val="22"/>
+        </w:rPr>
+        <w:t>vacios, sin lanzar ninguna excepcion.</w:t>
       </w:r>
     </w:p>
     <w:p>
@@ -2515,7 +3255,7 @@
           <w:color w:val="141414"/>
           <w:sz w:val="22"/>
         </w:rPr>
-        <w:t>para construir el significado de esa.</w:t>
+        <w:t>La implementacion de atencion que el modelo carga por defecto no llega a construir</w:t>
       </w:r>
     </w:p>
     <w:p>
@@ -2528,7 +3268,7 @@
           <w:color w:val="141414"/>
           <w:sz w:val="22"/>
         </w:rPr>
-        <w:t>Si borrara el codigo que dibuja el mapa, el asistente funcionaria igual:</w:t>
+        <w:t>esos pesos, porque es mas rapida asi, y hay que pedirle la clasica a mano.</w:t>
       </w:r>
     </w:p>
     <w:p>
@@ -2541,14 +3281,27 @@
           <w:color w:val="141414"/>
           <w:sz w:val="22"/>
         </w:rPr>
-        <w:t>eso</w:t>
+        <w:t xml:space="preserve">Lo peor era el silencio: un fallo que no se queja se te </w:t>
       </w:r>
       <w:r>
         <w:rPr>
           <w:color w:val="141414"/>
           <w:sz w:val="22"/>
         </w:rPr>
-        <w:t>s numeros se seguirian calculando. Lo unico que perderia es poder verlos.</w:t>
+        <w:t>cuela hasta el final.</w:t>
+      </w:r>
+    </w:p>
+    <w:p>
+      <w:pPr>
+        <w:spacing w:after="40"/>
+        <w:ind w:left="425"/>
+      </w:pPr>
+      <w:r>
+        <w:rPr>
+          <w:color w:val="141414"/>
+          <w:sz w:val="22"/>
+        </w:rPr>
+        <w:t>Ahora el codigo comprueba que los pesos existan y se detiene si vuelven vacios.</w:t>
       </w:r>
     </w:p>
     <w:p>
@@ -2562,7 +3315,7 @@
           <w:color w:val="141414"/>
           <w:sz w:val="23"/>
         </w:rPr>
-        <w:t>¿Por que no puedes ver los pesos del modelo de la nube?</w:t>
+        <w:t>¿Es seguro que el modelo ejecute cosas en tu computadora?</w:t>
       </w:r>
     </w:p>
     <w:p>
@@ -2591,7 +3344,7 @@
           <w:color w:val="141414"/>
           <w:sz w:val="22"/>
         </w:rPr>
-        <w:t>Porque ese modelo no corre en mi computadora: corre en los servidores del proveedor.</w:t>
+        <w:t>Todo lo que toca el sistema pasa antes por una lista blanca.</w:t>
       </w:r>
     </w:p>
     <w:p>
@@ -2604,14 +3357,14 @@
           <w:color w:val="141414"/>
           <w:sz w:val="22"/>
         </w:rPr>
-        <w:t>Lo unico que hay entre mi programa</w:t>
+        <w:t>La calculadora, por ejemplo,</w:t>
       </w:r>
       <w:r>
         <w:rPr>
           <w:color w:val="141414"/>
           <w:sz w:val="22"/>
         </w:rPr>
-        <w:t xml:space="preserve"> y el es una direccion web que recibe texto</w:t>
+        <w:t xml:space="preserve"> no usa la funcion de evaluar de Python,</w:t>
       </w:r>
     </w:p>
     <w:p>
@@ -2624,7 +3377,7 @@
           <w:color w:val="141414"/>
           <w:sz w:val="22"/>
         </w:rPr>
-        <w:t>y devuelve texto. Los pesos de atencion existen dentro de su servidor</w:t>
+        <w:t>que correria cualquier cosa que al modelo se le ocurra escribir:</w:t>
       </w:r>
     </w:p>
     <w:p>
@@ -2637,7 +3390,7 @@
           <w:color w:val="141414"/>
           <w:sz w:val="22"/>
         </w:rPr>
-        <w:t>mientras calcula, y ahi se quedan. No hay ningun parametro para pedirlos.</w:t>
+        <w:t>analiza la expresion y admite aritmetica y nada mas.</w:t>
       </w:r>
     </w:p>
     <w:p>
@@ -2650,28 +3403,27 @@
           <w:color w:val="141414"/>
           <w:sz w:val="22"/>
         </w:rPr>
-        <w:t>Por eso el laboratorio usa BETO, que se descarga y corre dentro de m</w:t>
-      </w:r>
+        <w:t>Las paginas y las carpetas que se pueden abrir salen de una lista cerrada.</w:t>
+      </w:r>
+    </w:p>
+    <w:p>
+      <w:pPr>
+        <w:spacing w:after="40"/>
+        <w:ind w:left="425"/>
+      </w:pPr>
       <w:r>
         <w:rPr>
           <w:color w:val="141414"/>
           <w:sz w:val="22"/>
         </w:rPr>
-        <w:t>i programa.</w:t>
-      </w:r>
-    </w:p>
-    <w:p>
-      <w:pPr>
-        <w:spacing w:before="60" w:after="100"/>
-        <w:ind w:left="425"/>
-      </w:pPr>
-      <w:r>
-        <w:rPr>
-          <w:i/>
-          <w:color w:val="4A4A52"/>
-          <w:sz w:val="19"/>
-        </w:rPr>
-        <w:t>Matiz importante: NO es que ese modelo no tenga atencion. Todos los Transformers la tienen. Es que no te deja verla.</w:t>
+        <w:t>El modelo propone la a</w:t>
+      </w:r>
+      <w:r>
+        <w:rPr>
+          <w:color w:val="141414"/>
+          <w:sz w:val="22"/>
+        </w:rPr>
+        <w:t>ccion, pero decidir que se ejecuta le corresponde al programa.</w:t>
       </w:r>
     </w:p>
     <w:p>
@@ -2685,590 +3437,7 @@
           <w:color w:val="141414"/>
           <w:sz w:val="23"/>
         </w:rPr>
-        <w:t>¿Que modelo usa cada cosa, y por que ese?</w:t>
-      </w:r>
-    </w:p>
-    <w:p>
-      <w:pPr>
-        <w:ind w:left="198"/>
-      </w:pPr>
-      <w:r>
-        <w:rPr>
-          <w:b/>
-          <w:color w:val="141414"/>
-        </w:rPr>
-        <w:t>Whisper large-v3</w:t>
-      </w:r>
-      <w:r>
-        <w:rPr>
-          <w:color w:val="141414"/>
-        </w:rPr>
-        <w:t xml:space="preserve"> (OpenAI) oye. Entrenado en muchos idiomas: el espanol le sale bien.</w:t>
-      </w:r>
-    </w:p>
-    <w:p>
-      <w:pPr>
-        <w:ind w:left="198"/>
-      </w:pPr>
-      <w:r>
-        <w:rPr>
-          <w:b/>
-          <w:color w:val="141414"/>
-        </w:rPr>
-        <w:t>Qwen3.8</w:t>
-      </w:r>
-      <w:r>
-        <w:rPr>
-          <w:color w:val="141414"/>
-        </w:rPr>
-        <w:t xml:space="preserve"> (Alibaba) piensa. Es de razonamiento: trabaja el problema antes de contestar.</w:t>
-      </w:r>
-    </w:p>
-    <w:p>
-      <w:pPr>
-        <w:ind w:left="198"/>
-      </w:pPr>
-      <w:r>
-        <w:rPr>
-          <w:b/>
-          <w:color w:val="141414"/>
-        </w:rPr>
-        <w:t>Llama-3.3-70B</w:t>
-      </w:r>
-      <w:r>
-        <w:rPr>
-          <w:color w:val="141414"/>
-        </w:rPr>
-        <w:t xml:space="preserve"> (Meta) es el alterno. 70B son setenta mil millones de parametros.</w:t>
-      </w:r>
-    </w:p>
-    <w:p>
-      <w:pPr>
-        <w:ind w:left="198"/>
-      </w:pPr>
-      <w:r>
-        <w:rPr>
-          <w:b/>
-          <w:color w:val="141414"/>
-        </w:rPr>
-        <w:t>edge-tts</w:t>
-      </w:r>
-      <w:r>
-        <w:rPr>
-          <w:color w:val="141414"/>
-        </w:rPr>
-        <w:t xml:space="preserve"> habla. No es un modelo: es una libreria que usa el servicio de voz de Microsoft.</w:t>
-      </w:r>
-    </w:p>
-    <w:p>
-      <w:pPr>
-        <w:ind w:left="198"/>
-      </w:pPr>
-      <w:r>
-        <w:rPr>
-          <w:b/>
-          <w:color w:val="141414"/>
-        </w:rPr>
-        <w:t>BETO</w:t>
-      </w:r>
-      <w:r>
-        <w:rPr>
-          <w:color w:val="141414"/>
-        </w:rPr>
-        <w:t xml:space="preserve"> (Universidad de Chile) no conversa. 110 millones de parametros, solo espanol, y se deja abrir por dentro.</w:t>
-      </w:r>
-    </w:p>
-    <w:p>
-      <w:pPr>
-        <w:keepNext/>
-        <w:spacing w:before="220" w:after="80"/>
-      </w:pPr>
-      <w:r>
-        <w:rPr>
-          <w:b/>
-          <w:color w:val="141414"/>
-          <w:sz w:val="23"/>
-        </w:rPr>
-        <w:t>¿Por que dos modelos de lenguaje y no uno?</w:t>
-      </w:r>
-    </w:p>
-    <w:p>
-      <w:pPr>
-        <w:keepNext/>
-        <w:spacing w:before="80" w:after="40"/>
-        <w:ind w:left="170"/>
-      </w:pPr>
-      <w:r>
-        <w:rPr>
-          <w:rFonts w:ascii="Consolas" w:hAnsi="Consolas"/>
-          <w:b/>
-          <w:color w:val="141414"/>
-          <w:sz w:val="19"/>
-        </w:rPr>
-        <w:t>DICES:</w:t>
-      </w:r>
-    </w:p>
-    <w:p>
-      <w:pPr>
-        <w:spacing w:after="40"/>
-        <w:ind w:left="425"/>
-      </w:pPr>
-      <w:r>
-        <w:rPr>
-          <w:color w:val="141414"/>
-          <w:sz w:val="22"/>
-        </w:rPr>
-        <w:t>Por una incidencia real. A tres dias de la entrega el proveedor retiro el alternativo</w:t>
-      </w:r>
-    </w:p>
-    <w:p>
-      <w:pPr>
-        <w:spacing w:after="40"/>
-        <w:ind w:left="425"/>
-      </w:pPr>
-      <w:r>
-        <w:rPr>
-          <w:color w:val="141414"/>
-          <w:sz w:val="22"/>
-        </w:rPr>
-        <w:t>que tenia</w:t>
-      </w:r>
-      <w:r>
-        <w:rPr>
-          <w:color w:val="141414"/>
-          <w:sz w:val="22"/>
-        </w:rPr>
-        <w:t xml:space="preserve"> puesto. Probe los ciento sesenta y nueve modelos del catalogo</w:t>
-      </w:r>
-    </w:p>
-    <w:p>
-      <w:pPr>
-        <w:spacing w:after="40"/>
-        <w:ind w:left="425"/>
-      </w:pPr>
-      <w:r>
-        <w:rPr>
-          <w:color w:val="141414"/>
-          <w:sz w:val="22"/>
-        </w:rPr>
-        <w:t>y solo veinte respondian.</w:t>
-      </w:r>
-    </w:p>
-    <w:p>
-      <w:pPr>
-        <w:spacing w:after="40"/>
-        <w:ind w:left="425"/>
-      </w:pPr>
-      <w:r>
-        <w:rPr>
-          <w:color w:val="141414"/>
-          <w:sz w:val="22"/>
-        </w:rPr>
-        <w:t>Los elegi de familias distintas a proposito: si los dos vienen de la misma,</w:t>
-      </w:r>
-    </w:p>
-    <w:p>
-      <w:pPr>
-        <w:spacing w:after="40"/>
-        <w:ind w:left="425"/>
-      </w:pPr>
-      <w:r>
-        <w:rPr>
-          <w:color w:val="141414"/>
-          <w:sz w:val="22"/>
-        </w:rPr>
-        <w:t>un problema del proveedor se los lleva a la vez.</w:t>
-      </w:r>
-    </w:p>
-    <w:p>
-      <w:pPr>
-        <w:keepNext/>
-        <w:spacing w:before="220" w:after="80"/>
-      </w:pPr>
-      <w:r>
-        <w:rPr>
-          <w:b/>
-          <w:color w:val="141414"/>
-          <w:sz w:val="23"/>
-        </w:rPr>
-        <w:t>¿Como funciona sin internet?</w:t>
-      </w:r>
-    </w:p>
-    <w:p>
-      <w:pPr>
-        <w:keepNext/>
-        <w:spacing w:before="80" w:after="40"/>
-        <w:ind w:left="170"/>
-      </w:pPr>
-      <w:r>
-        <w:rPr>
-          <w:rFonts w:ascii="Consolas" w:hAnsi="Consolas"/>
-          <w:b/>
-          <w:color w:val="141414"/>
-          <w:sz w:val="19"/>
-        </w:rPr>
-        <w:t>DICES:</w:t>
-      </w:r>
-    </w:p>
-    <w:p>
-      <w:pPr>
-        <w:spacing w:after="40"/>
-        <w:ind w:left="425"/>
-      </w:pPr>
-      <w:r>
-        <w:rPr>
-          <w:color w:val="141414"/>
-          <w:sz w:val="22"/>
-        </w:rPr>
-        <w:t xml:space="preserve">Si </w:t>
-      </w:r>
-      <w:r>
-        <w:rPr>
-          <w:color w:val="141414"/>
-          <w:sz w:val="22"/>
-        </w:rPr>
-        <w:t>se cae la red, las tres piezas cambian solas a equivalentes que corren en mi laptop.</w:t>
-      </w:r>
-    </w:p>
-    <w:p>
-      <w:pPr>
-        <w:spacing w:after="40"/>
-        <w:ind w:left="425"/>
-      </w:pPr>
-      <w:r>
-        <w:rPr>
-          <w:color w:val="141414"/>
-          <w:sz w:val="22"/>
-        </w:rPr>
-        <w:t>Responde bastante peor, y no tiene sentido disimularlo: el modelo local es unas mil veces</w:t>
-      </w:r>
-    </w:p>
-    <w:p>
-      <w:pPr>
-        <w:spacing w:after="40"/>
-        <w:ind w:left="425"/>
-      </w:pPr>
-      <w:r>
-        <w:rPr>
-          <w:color w:val="141414"/>
-          <w:sz w:val="22"/>
-        </w:rPr>
-        <w:t>mas pequeno. A cambio, responde. Sin eso, quedarse sin red dejaba la aplicacion m</w:t>
-      </w:r>
-      <w:r>
-        <w:rPr>
-          <w:color w:val="141414"/>
-          <w:sz w:val="22"/>
-        </w:rPr>
-        <w:t>uerta.</w:t>
-      </w:r>
-    </w:p>
-    <w:p>
-      <w:pPr>
-        <w:spacing w:after="40"/>
-        <w:ind w:left="425"/>
-      </w:pPr>
-      <w:r>
-        <w:rPr>
-          <w:color w:val="141414"/>
-          <w:sz w:val="22"/>
-        </w:rPr>
-        <w:lastRenderedPageBreak/>
-        <w:t>Y el cambio no es ciego: distingue entre quedarse sin red y tener la clave mal escrita.</w:t>
-      </w:r>
-    </w:p>
-    <w:p>
-      <w:pPr>
-        <w:spacing w:after="40"/>
-        <w:ind w:left="425"/>
-      </w:pPr>
-      <w:r>
-        <w:rPr>
-          <w:color w:val="141414"/>
-          <w:sz w:val="22"/>
-        </w:rPr>
-        <w:t>Si es la clave, no cambia a local, porque eso taparia un error de configuracion.</w:t>
-      </w:r>
-    </w:p>
-    <w:p>
-      <w:pPr>
-        <w:spacing w:before="60" w:after="100"/>
-        <w:ind w:left="425"/>
-      </w:pPr>
-      <w:r>
-        <w:rPr>
-          <w:i/>
-          <w:color w:val="4A4A52"/>
-          <w:sz w:val="19"/>
-        </w:rPr>
-        <w:t xml:space="preserve">Como lo hice sin duplicar codigo: envolvi las tres piezas de nube, cada una con </w:t>
-      </w:r>
-      <w:r>
-        <w:rPr>
-          <w:i/>
-          <w:color w:val="4A4A52"/>
-          <w:sz w:val="19"/>
-        </w:rPr>
-        <w:t>su equivalente local. El orquestador ni se entera de que existen.</w:t>
-      </w:r>
-    </w:p>
-    <w:p>
-      <w:pPr>
-        <w:keepNext/>
-        <w:spacing w:before="220" w:after="80"/>
-      </w:pPr>
-      <w:r>
-        <w:rPr>
-          <w:b/>
-          <w:color w:val="141414"/>
-          <w:sz w:val="23"/>
-        </w:rPr>
-        <w:t>¿Que fue lo mas dificil?</w:t>
-      </w:r>
-    </w:p>
-    <w:p>
-      <w:pPr>
-        <w:keepNext/>
-        <w:spacing w:before="80" w:after="40"/>
-        <w:ind w:left="170"/>
-      </w:pPr>
-      <w:r>
-        <w:rPr>
-          <w:rFonts w:ascii="Consolas" w:hAnsi="Consolas"/>
-          <w:b/>
-          <w:color w:val="141414"/>
-          <w:sz w:val="19"/>
-        </w:rPr>
-        <w:t>DICES:</w:t>
-      </w:r>
-    </w:p>
-    <w:p>
-      <w:pPr>
-        <w:spacing w:after="40"/>
-        <w:ind w:left="425"/>
-      </w:pPr>
-      <w:r>
-        <w:rPr>
-          <w:color w:val="141414"/>
-          <w:sz w:val="22"/>
-        </w:rPr>
-        <w:t>Un fallo silencioso en el laboratorio. Pedia los pesos de atencion</w:t>
-      </w:r>
-    </w:p>
-    <w:p>
-      <w:pPr>
-        <w:spacing w:after="40"/>
-        <w:ind w:left="425"/>
-      </w:pPr>
-      <w:r>
-        <w:rPr>
-          <w:color w:val="141414"/>
-          <w:sz w:val="22"/>
-        </w:rPr>
-        <w:t>y me llegaban vacios, sin lanzar ninguna excepcion.</w:t>
-      </w:r>
-    </w:p>
-    <w:p>
-      <w:pPr>
-        <w:spacing w:after="40"/>
-        <w:ind w:left="425"/>
-      </w:pPr>
-      <w:r>
-        <w:rPr>
-          <w:color w:val="141414"/>
-          <w:sz w:val="22"/>
-        </w:rPr>
-        <w:t>La implementacion de atencion que el mo</w:t>
-      </w:r>
-      <w:r>
-        <w:rPr>
-          <w:color w:val="141414"/>
-          <w:sz w:val="22"/>
-        </w:rPr>
-        <w:t>delo carga por defecto no llega a construir</w:t>
-      </w:r>
-    </w:p>
-    <w:p>
-      <w:pPr>
-        <w:spacing w:after="40"/>
-        <w:ind w:left="425"/>
-      </w:pPr>
-      <w:r>
-        <w:rPr>
-          <w:color w:val="141414"/>
-          <w:sz w:val="22"/>
-        </w:rPr>
-        <w:t>esos pesos, porque es mas rapida asi, y hay que pedirle la clasica a mano.</w:t>
-      </w:r>
-    </w:p>
-    <w:p>
-      <w:pPr>
-        <w:spacing w:after="40"/>
-        <w:ind w:left="425"/>
-      </w:pPr>
-      <w:r>
-        <w:rPr>
-          <w:color w:val="141414"/>
-          <w:sz w:val="22"/>
-        </w:rPr>
-        <w:t>Lo peor era el silencio: un fallo que no se queja se te cuela hasta el final.</w:t>
-      </w:r>
-    </w:p>
-    <w:p>
-      <w:pPr>
-        <w:spacing w:after="40"/>
-        <w:ind w:left="425"/>
-      </w:pPr>
-      <w:r>
-        <w:rPr>
-          <w:color w:val="141414"/>
-          <w:sz w:val="22"/>
-        </w:rPr>
-        <w:t>Ahora el codigo comprueba que los pesos existan y se detien</w:t>
-      </w:r>
-      <w:r>
-        <w:rPr>
-          <w:color w:val="141414"/>
-          <w:sz w:val="22"/>
-        </w:rPr>
-        <w:t>e si vuelven vacios.</w:t>
-      </w:r>
-    </w:p>
-    <w:p>
-      <w:pPr>
-        <w:keepNext/>
-        <w:spacing w:before="220" w:after="80"/>
-      </w:pPr>
-      <w:r>
-        <w:rPr>
-          <w:b/>
-          <w:color w:val="141414"/>
-          <w:sz w:val="23"/>
-        </w:rPr>
-        <w:t>¿Es seguro que el modelo ejecute cosas en tu computadora?</w:t>
-      </w:r>
-    </w:p>
-    <w:p>
-      <w:pPr>
-        <w:keepNext/>
-        <w:spacing w:before="80" w:after="40"/>
-        <w:ind w:left="170"/>
-      </w:pPr>
-      <w:r>
-        <w:rPr>
-          <w:rFonts w:ascii="Consolas" w:hAnsi="Consolas"/>
-          <w:b/>
-          <w:color w:val="141414"/>
-          <w:sz w:val="19"/>
-        </w:rPr>
-        <w:t>DICES:</w:t>
-      </w:r>
-    </w:p>
-    <w:p>
-      <w:pPr>
-        <w:spacing w:after="40"/>
-        <w:ind w:left="425"/>
-      </w:pPr>
-      <w:r>
-        <w:rPr>
-          <w:color w:val="141414"/>
-          <w:sz w:val="22"/>
-        </w:rPr>
-        <w:t>Todo lo que toca el sistema pasa antes por una lista blanca.</w:t>
-      </w:r>
-    </w:p>
-    <w:p>
-      <w:pPr>
-        <w:spacing w:after="40"/>
-        <w:ind w:left="425"/>
-      </w:pPr>
-      <w:r>
-        <w:rPr>
-          <w:color w:val="141414"/>
-          <w:sz w:val="22"/>
-        </w:rPr>
-        <w:t>La calculadora, por ejemplo, no usa la funcion de evaluar de Python,</w:t>
-      </w:r>
-    </w:p>
-    <w:p>
-      <w:pPr>
-        <w:spacing w:after="40"/>
-        <w:ind w:left="425"/>
-      </w:pPr>
-      <w:r>
-        <w:rPr>
-          <w:color w:val="141414"/>
-          <w:sz w:val="22"/>
-        </w:rPr>
-        <w:t>que correria cualquier cosa que al model</w:t>
-      </w:r>
-      <w:r>
-        <w:rPr>
-          <w:color w:val="141414"/>
-          <w:sz w:val="22"/>
-        </w:rPr>
-        <w:t>o se le ocurra escribir:</w:t>
-      </w:r>
-    </w:p>
-    <w:p>
-      <w:pPr>
-        <w:spacing w:after="40"/>
-        <w:ind w:left="425"/>
-      </w:pPr>
-      <w:r>
-        <w:rPr>
-          <w:color w:val="141414"/>
-          <w:sz w:val="22"/>
-        </w:rPr>
-        <w:t>analiza la expresion y admite aritmetica y nada mas.</w:t>
-      </w:r>
-    </w:p>
-    <w:p>
-      <w:pPr>
-        <w:spacing w:after="40"/>
-        <w:ind w:left="425"/>
-      </w:pPr>
-      <w:r>
-        <w:rPr>
-          <w:color w:val="141414"/>
-          <w:sz w:val="22"/>
-        </w:rPr>
-        <w:t>Las paginas y las carpetas que se pueden abrir salen de una lista cerrada.</w:t>
-      </w:r>
-    </w:p>
-    <w:p>
-      <w:pPr>
-        <w:spacing w:after="40"/>
-        <w:ind w:left="425"/>
-      </w:pPr>
-      <w:r>
-        <w:rPr>
-          <w:color w:val="141414"/>
-          <w:sz w:val="22"/>
-        </w:rPr>
-        <w:t>El modelo propone la accion, pero decidir que se ejecuta le corresponde al programa.</w:t>
-      </w:r>
-    </w:p>
-    <w:p>
-      <w:pPr>
-        <w:keepNext/>
-        <w:spacing w:before="220" w:after="80"/>
-      </w:pPr>
-      <w:r>
-        <w:rPr>
-          <w:b/>
-          <w:color w:val="141414"/>
-          <w:sz w:val="23"/>
-        </w:rPr>
-        <w:t xml:space="preserve">¿Cuantas </w:t>
-      </w:r>
-      <w:r>
-        <w:rPr>
-          <w:b/>
-          <w:color w:val="141414"/>
-          <w:sz w:val="23"/>
-        </w:rPr>
-        <w:t>pruebas tienes?</w:t>
+        <w:t>¿Cuantas pruebas tienes?</w:t>
       </w:r>
     </w:p>
     <w:p>
@@ -3344,7 +3513,6 @@
     <w:p>
       <w:pPr>
         <w:keepNext/>
-        <w:spacing w:after="180"/>
       </w:pPr>
       <w:r>
         <w:rPr>
@@ -3357,21 +3525,29 @@
     </w:p>
     <w:p>
       <w:pPr>
-        <w:spacing w:after="140"/>
-      </w:pPr>
-      <w:r>
-        <w:rPr>
+        <w:keepNext/>
+        <w:spacing w:after="180"/>
+      </w:pPr>
+      <w:r>
+        <w:rPr>
+          <w:rFonts w:ascii="Consolas" w:hAnsi="Consolas"/>
           <w:i/>
           <w:color w:val="4A4A52"/>
-        </w:rPr>
-        <w:t xml:space="preserve">Dilas tu primero. Que te las saquen </w:t>
-      </w:r>
+          <w:sz w:val="20"/>
+        </w:rPr>
+        <w:t>Las limitaciones las sacas TU, en medio minuto. La etica, solo si preguntan.</w:t>
+      </w:r>
+    </w:p>
+    <w:p>
+      <w:pPr>
+        <w:spacing w:after="140"/>
+      </w:pPr>
       <w:r>
         <w:rPr>
           <w:i/>
           <w:color w:val="4A4A52"/>
         </w:rPr>
-        <w:t>ellos, resta.</w:t>
+        <w:t>Dilas tu primero. Que te las saquen ellos, resta.</w:t>
       </w:r>
     </w:p>
     <w:p>
@@ -3427,7 +3603,14 @@
           <w:color w:val="141414"/>
           <w:sz w:val="22"/>
         </w:rPr>
-        <w:t>y decirlo con el mismo tono de seguridad que uno cierto.</w:t>
+        <w:t xml:space="preserve">y </w:t>
+      </w:r>
+      <w:r>
+        <w:rPr>
+          <w:color w:val="141414"/>
+          <w:sz w:val="22"/>
+        </w:rPr>
+        <w:t>decirlo con el mismo tono de seguridad que uno cierto.</w:t>
       </w:r>
     </w:p>
     <w:p>
@@ -3453,14 +3636,7 @@
           <w:color w:val="141414"/>
           <w:sz w:val="22"/>
         </w:rPr>
-        <w:t xml:space="preserve">sino de como funciona un modelo de </w:t>
-      </w:r>
-      <w:r>
-        <w:rPr>
-          <w:color w:val="141414"/>
-          <w:sz w:val="22"/>
-        </w:rPr>
-        <w:t>lenguaje. Lo que si hice fue avisarlo.</w:t>
+        <w:t>sino de como funciona un modelo de lenguaje. Lo que si hice fue avisarlo.</w:t>
       </w:r>
     </w:p>
     <w:p>
@@ -3486,7 +3662,15 @@
           <w:color w:val="141414"/>
           <w:sz w:val="22"/>
         </w:rPr>
-        <w:t>El modelo principal es cerrado: no puedo ver sus pesos ni saber con que datos</w:t>
+        <w:lastRenderedPageBreak/>
+        <w:t>El modelo principal es ce</w:t>
+      </w:r>
+      <w:r>
+        <w:rPr>
+          <w:color w:val="141414"/>
+          <w:sz w:val="22"/>
+        </w:rPr>
+        <w:t>rrado: no puedo ver sus pesos ni saber con que datos</w:t>
       </w:r>
     </w:p>
     <w:p>
@@ -3512,14 +3696,7 @@
           <w:color w:val="141414"/>
           <w:sz w:val="22"/>
         </w:rPr>
-        <w:t>La transcripcion falla con ruido de fondo o s</w:t>
-      </w:r>
-      <w:r>
-        <w:rPr>
-          <w:color w:val="141414"/>
-          <w:sz w:val="22"/>
-        </w:rPr>
-        <w:t>i se habla lejos del microfono.</w:t>
+        <w:t>La transcripcion falla con ruido de fondo o si se habla lejos del microfono.</w:t>
       </w:r>
     </w:p>
     <w:p>
@@ -3546,7 +3723,15 @@
           <w:color w:val="4A4A52"/>
           <w:sz w:val="19"/>
         </w:rPr>
-        <w:t>Lo de no poder auditar los sesgos es un nivel mas: reconoces el limite de tu propia revision, no solo el del sistema.</w:t>
+        <w:t xml:space="preserve">Lo de no poder auditar los </w:t>
+      </w:r>
+      <w:r>
+        <w:rPr>
+          <w:i/>
+          <w:color w:val="4A4A52"/>
+          <w:sz w:val="19"/>
+        </w:rPr>
+        <w:t>sesgos es un nivel mas: reconoces el limite de tu propia revision, no solo el del sistema.</w:t>
       </w:r>
     </w:p>
     <w:p>
@@ -3560,7 +3745,6 @@
           <w:color w:val="0B6B63"/>
           <w:sz w:val="26"/>
         </w:rPr>
-        <w:lastRenderedPageBreak/>
         <w:t>Etica</w:t>
       </w:r>
     </w:p>
@@ -3573,13 +3757,7 @@
         <w:rPr>
           <w:color w:val="141414"/>
         </w:rPr>
-        <w:t xml:space="preserve">•  Ninguna clave en el repositorio. Van en .env, que git </w:t>
-      </w:r>
-      <w:r>
-        <w:rPr>
-          <w:color w:val="141414"/>
-        </w:rPr>
-        <w:t>ignora.</w:t>
+        <w:t>•  Ninguna clave en el repositorio. Van en .env, que git ignora.</w:t>
       </w:r>
     </w:p>
     <w:p>
@@ -3603,7 +3781,13 @@
         <w:rPr>
           <w:color w:val="141414"/>
         </w:rPr>
-        <w:t>•  Elena avisa al arrancar que es una IA y que puede equivocarse.</w:t>
+        <w:t>•  Elena avisa al arrancar q</w:t>
+      </w:r>
+      <w:r>
+        <w:rPr>
+          <w:color w:val="141414"/>
+        </w:rPr>
+        <w:t>ue es una IA y que puede equivocarse.</w:t>
       </w:r>
     </w:p>
     <w:p>
@@ -3627,13 +3811,7 @@
         <w:rPr>
           <w:color w:val="141414"/>
         </w:rPr>
-        <w:t>•  La voz no se guarda en disco. Se tr</w:t>
-      </w:r>
-      <w:r>
-        <w:rPr>
-          <w:color w:val="141414"/>
-        </w:rPr>
-        <w:t>anscribe y se descarta.</w:t>
+        <w:t>•  La voz no se guarda en disco. Se transcribe y se descarta.</w:t>
       </w:r>
     </w:p>
     <w:p>
@@ -3657,7 +3835,13 @@
         <w:rPr>
           <w:color w:val="141414"/>
         </w:rPr>
-        <w:t>•  Modelos y proveedores citados explicitamente.</w:t>
+        <w:t>•  Modelos y provee</w:t>
+      </w:r>
+      <w:r>
+        <w:rPr>
+          <w:color w:val="141414"/>
+        </w:rPr>
+        <w:t>dores citados explicitamente.</w:t>
       </w:r>
     </w:p>
     <w:p>
@@ -3678,7 +3862,6 @@
     <w:p>
       <w:pPr>
         <w:keepNext/>
-        <w:spacing w:after="180"/>
       </w:pPr>
       <w:r>
         <w:rPr>
@@ -3692,6 +3875,21 @@
     <w:p>
       <w:pPr>
         <w:keepNext/>
+        <w:spacing w:after="180"/>
+      </w:pPr>
+      <w:r>
+        <w:rPr>
+          <w:rFonts w:ascii="Consolas" w:hAnsi="Consolas"/>
+          <w:i/>
+          <w:color w:val="4A4A52"/>
+          <w:sz w:val="20"/>
+        </w:rPr>
+        <w:t>Lo de arriba solo si falla algo. El cierre SIEMPRE.</w:t>
+      </w:r>
+    </w:p>
+    <w:p>
+      <w:pPr>
+        <w:keepNext/>
         <w:spacing w:before="80" w:after="100"/>
       </w:pPr>
       <w:r>
@@ -3731,7 +3929,13 @@
         <w:rPr>
           <w:color w:val="141414"/>
         </w:rPr>
-        <w:t>"esto es latencia de red: la peticion viaja a un servidor y vuelve"</w:t>
+        <w:t xml:space="preserve">"esto es latencia de red: la peticion viaja a un </w:t>
+      </w:r>
+      <w:r>
+        <w:rPr>
+          <w:color w:val="141414"/>
+        </w:rPr>
+        <w:t>servidor y vuelve"</w:t>
       </w:r>
     </w:p>
     <w:p>
@@ -3767,13 +3971,7 @@
         <w:rPr>
           <w:color w:val="141414"/>
         </w:rPr>
-        <w:t>perfecto: ensena el modo sin internet. Suma en vez de r</w:t>
-      </w:r>
-      <w:r>
-        <w:rPr>
-          <w:color w:val="141414"/>
-        </w:rPr>
-        <w:t>estar.</w:t>
+        <w:t>perfecto: ensena el modo sin internet. Suma en vez de restar.</w:t>
       </w:r>
     </w:p>
     <w:p>
@@ -3791,7 +3989,13 @@
         <w:rPr>
           <w:color w:val="141414"/>
         </w:rPr>
-        <w:t>"esto es el manejo de errores funcionando: la aplicacion no se cae"</w:t>
+        <w:t>"esto es el manejo de errores funcionand</w:t>
+      </w:r>
+      <w:r>
+        <w:rPr>
+          <w:color w:val="141414"/>
+        </w:rPr>
+        <w:t>o: la aplicacion no se cae"</w:t>
       </w:r>
     </w:p>
     <w:p>
@@ -3861,7 +4065,7 @@
           <w:color w:val="4A4A52"/>
           <w:sz w:val="19"/>
         </w:rPr>
-        <w:t xml:space="preserve">Y lo llevas a algo que si </w:t>
+        <w:t xml:space="preserve">Y lo llevas a algo que si hiciste. Reconocer un limite y redirigir a evidencia real </w:t>
       </w:r>
       <w:r>
         <w:rPr>
@@ -3869,7 +4073,7 @@
           <w:color w:val="4A4A52"/>
           <w:sz w:val="19"/>
         </w:rPr>
-        <w:t>hiciste. Reconocer un limite y redirigir a evidencia real demuestra que sabes distinguir lo que verificaste de lo que no.</w:t>
+        <w:t>demuestra que sabes distinguir lo que verificaste de lo que no.</w:t>
       </w:r>
     </w:p>
     <w:p>
@@ -3925,14 +4129,7 @@
           <w:color w:val="141414"/>
           <w:sz w:val="22"/>
         </w:rPr>
-        <w:t>el laboratorio evidencia los cuatro conc</w:t>
-      </w:r>
-      <w:r>
-        <w:rPr>
-          <w:color w:val="141414"/>
-          <w:sz w:val="22"/>
-        </w:rPr>
-        <w:t>eptos con la salida del propio programa,</w:t>
+        <w:t>el laboratorio evidencia los cuatro conceptos con la salida del propio programa,</w:t>
       </w:r>
     </w:p>
     <w:p>
@@ -3945,7 +4142,14 @@
           <w:color w:val="141414"/>
           <w:sz w:val="22"/>
         </w:rPr>
-        <w:t>hay ciento ochenta y nueve pruebas automaticas,</w:t>
+        <w:t>hay ciento ochent</w:t>
+      </w:r>
+      <w:r>
+        <w:rPr>
+          <w:color w:val="141414"/>
+          <w:sz w:val="22"/>
+        </w:rPr>
+        <w:t>a y nueve pruebas automaticas,</w:t>
       </w:r>
     </w:p>
     <w:p>
@@ -3984,14 +4188,7 @@
           <w:color w:val="141414"/>
           <w:sz w:val="22"/>
         </w:rPr>
-        <w:t>Lo que no puedo arreglar con codigo, que es que el modelo s</w:t>
-      </w:r>
-      <w:r>
-        <w:rPr>
-          <w:color w:val="141414"/>
-          <w:sz w:val="22"/>
-        </w:rPr>
-        <w:t>e equivoque,</w:t>
+        <w:t>Lo que no puedo arreglar con codigo, que es que el modelo se equivoque,</w:t>
       </w:r>
     </w:p>
     <w:p>

</xml_diff>